<commit_message>
Add second batch of Groceryshop sessions
Matches the closing panel transcript to the Groceryshop Key Takeaways
session (Thu 24 Sep, Capsule Stage) and uses Kelly Lindenau's name from
the app. Adds New Opportunities for 1:1 Personalization and a women in
the C-suite session whose title and time are still to be confirmed.

Co-Authored-By: Claude Opus 5.5 <noreply@anthropic.com>
Claude-Session: https://claude.ai/code/session_01KmRp2ESunoKfn1WQuEFGHQ
</commit_message>
<xml_diff>
--- a/transcripts/Groceryshop_2026_Session_Notes.docx
+++ b/transcripts/Groceryshop_2026_Session_Notes.docx
@@ -854,6 +854,301 @@
                 <w:sz w:val="20"/>
                 <w:szCs w:val="20"/>
               </w:rPr>
+              <w:t xml:space="preserve">Thu, 24 Sep 2026</w:t>
+            </w:r>
+          </w:p>
+        </w:tc>
+        <w:tc>
+          <w:tcPr>
+            <w:tcW w:type="dxa" w:w="1900"/>
+            <w:tcBorders>
+              <w:top w:val="single" w:color="BFBFBF" w:sz="4"/>
+              <w:left w:val="single" w:color="BFBFBF" w:sz="4"/>
+              <w:bottom w:val="single" w:color="BFBFBF" w:sz="4"/>
+              <w:right w:val="single" w:color="BFBFBF" w:sz="4"/>
+            </w:tcBorders>
+            <w:tcMar>
+              <w:top w:type="dxa" w:w="80"/>
+              <w:left w:type="dxa" w:w="120"/>
+              <w:bottom w:type="dxa" w:w="80"/>
+              <w:right w:type="dxa" w:w="120"/>
+            </w:tcMar>
+          </w:tcPr>
+          <w:p>
+            <w:r>
+              <w:rPr>
+                <w:b w:val="false"/>
+                <w:bCs w:val="false"/>
+                <w:sz w:val="20"/>
+                <w:szCs w:val="20"/>
+              </w:rPr>
+              <w:t xml:space="preserve">2:20 PM – 3:00 PM PT</w:t>
+            </w:r>
+          </w:p>
+        </w:tc>
+        <w:tc>
+          <w:tcPr>
+            <w:tcW w:type="dxa" w:w="1500"/>
+            <w:tcBorders>
+              <w:top w:val="single" w:color="BFBFBF" w:sz="4"/>
+              <w:left w:val="single" w:color="BFBFBF" w:sz="4"/>
+              <w:bottom w:val="single" w:color="BFBFBF" w:sz="4"/>
+              <w:right w:val="single" w:color="BFBFBF" w:sz="4"/>
+            </w:tcBorders>
+            <w:tcMar>
+              <w:top w:type="dxa" w:w="80"/>
+              <w:left w:type="dxa" w:w="120"/>
+              <w:bottom w:type="dxa" w:w="80"/>
+              <w:right w:type="dxa" w:w="120"/>
+            </w:tcMar>
+          </w:tcPr>
+          <w:p>
+            <w:r>
+              <w:rPr>
+                <w:b w:val="false"/>
+                <w:bCs w:val="false"/>
+                <w:sz w:val="20"/>
+                <w:szCs w:val="20"/>
+              </w:rPr>
+              <w:t xml:space="preserve">Snackable Insights Stage</w:t>
+            </w:r>
+          </w:p>
+        </w:tc>
+        <w:tc>
+          <w:tcPr>
+            <w:tcW w:type="dxa" w:w="3060"/>
+            <w:tcBorders>
+              <w:top w:val="single" w:color="BFBFBF" w:sz="4"/>
+              <w:left w:val="single" w:color="BFBFBF" w:sz="4"/>
+              <w:bottom w:val="single" w:color="BFBFBF" w:sz="4"/>
+              <w:right w:val="single" w:color="BFBFBF" w:sz="4"/>
+            </w:tcBorders>
+            <w:tcMar>
+              <w:top w:type="dxa" w:w="80"/>
+              <w:left w:type="dxa" w:w="120"/>
+              <w:bottom w:type="dxa" w:w="80"/>
+              <w:right w:type="dxa" w:w="120"/>
+            </w:tcMar>
+          </w:tcPr>
+          <w:p>
+            <w:r>
+              <w:rPr>
+                <w:b w:val="false"/>
+                <w:bCs w:val="false"/>
+                <w:sz w:val="20"/>
+                <w:szCs w:val="20"/>
+              </w:rPr>
+              <w:t xml:space="preserve">New Opportunities for 1:1 Personalization</w:t>
+            </w:r>
+          </w:p>
+        </w:tc>
+        <w:tc>
+          <w:tcPr>
+            <w:tcW w:type="dxa" w:w="1400"/>
+            <w:tcBorders>
+              <w:top w:val="single" w:color="BFBFBF" w:sz="4"/>
+              <w:left w:val="single" w:color="BFBFBF" w:sz="4"/>
+              <w:bottom w:val="single" w:color="BFBFBF" w:sz="4"/>
+              <w:right w:val="single" w:color="BFBFBF" w:sz="4"/>
+            </w:tcBorders>
+            <w:tcMar>
+              <w:top w:type="dxa" w:w="80"/>
+              <w:left w:type="dxa" w:w="120"/>
+              <w:bottom w:type="dxa" w:w="80"/>
+              <w:right w:type="dxa" w:w="120"/>
+            </w:tcMar>
+          </w:tcPr>
+          <w:p>
+            <w:r>
+              <w:rPr>
+                <w:b w:val="false"/>
+                <w:bCs w:val="false"/>
+                <w:sz w:val="20"/>
+                <w:szCs w:val="20"/>
+              </w:rPr>
+              <w:t xml:space="preserve">Transcript to follow</w:t>
+            </w:r>
+          </w:p>
+        </w:tc>
+      </w:tr>
+      <w:tr>
+        <w:trPr>
+          <w:cantSplit/>
+        </w:trPr>
+        <w:tc>
+          <w:tcPr>
+            <w:tcW w:type="dxa" w:w="1500"/>
+            <w:tcBorders>
+              <w:top w:val="single" w:color="BFBFBF" w:sz="4"/>
+              <w:left w:val="single" w:color="BFBFBF" w:sz="4"/>
+              <w:bottom w:val="single" w:color="BFBFBF" w:sz="4"/>
+              <w:right w:val="single" w:color="BFBFBF" w:sz="4"/>
+            </w:tcBorders>
+            <w:shd w:fill="F2F2F2" w:color="auto" w:val="clear"/>
+            <w:tcMar>
+              <w:top w:type="dxa" w:w="80"/>
+              <w:left w:type="dxa" w:w="120"/>
+              <w:bottom w:type="dxa" w:w="80"/>
+              <w:right w:type="dxa" w:w="120"/>
+            </w:tcMar>
+          </w:tcPr>
+          <w:p>
+            <w:r>
+              <w:rPr>
+                <w:b w:val="false"/>
+                <w:bCs w:val="false"/>
+                <w:sz w:val="20"/>
+                <w:szCs w:val="20"/>
+              </w:rPr>
+              <w:t xml:space="preserve">Thu, 24 Sep 2026</w:t>
+            </w:r>
+          </w:p>
+        </w:tc>
+        <w:tc>
+          <w:tcPr>
+            <w:tcW w:type="dxa" w:w="1900"/>
+            <w:tcBorders>
+              <w:top w:val="single" w:color="BFBFBF" w:sz="4"/>
+              <w:left w:val="single" w:color="BFBFBF" w:sz="4"/>
+              <w:bottom w:val="single" w:color="BFBFBF" w:sz="4"/>
+              <w:right w:val="single" w:color="BFBFBF" w:sz="4"/>
+            </w:tcBorders>
+            <w:shd w:fill="F2F2F2" w:color="auto" w:val="clear"/>
+            <w:tcMar>
+              <w:top w:type="dxa" w:w="80"/>
+              <w:left w:type="dxa" w:w="120"/>
+              <w:bottom w:type="dxa" w:w="80"/>
+              <w:right w:type="dxa" w:w="120"/>
+            </w:tcMar>
+          </w:tcPr>
+          <w:p>
+            <w:r>
+              <w:rPr>
+                <w:b w:val="false"/>
+                <w:bCs w:val="false"/>
+                <w:sz w:val="20"/>
+                <w:szCs w:val="20"/>
+              </w:rPr>
+              <w:t xml:space="preserve">3:10 PM – 3:50 PM PT</w:t>
+            </w:r>
+          </w:p>
+        </w:tc>
+        <w:tc>
+          <w:tcPr>
+            <w:tcW w:type="dxa" w:w="1500"/>
+            <w:tcBorders>
+              <w:top w:val="single" w:color="BFBFBF" w:sz="4"/>
+              <w:left w:val="single" w:color="BFBFBF" w:sz="4"/>
+              <w:bottom w:val="single" w:color="BFBFBF" w:sz="4"/>
+              <w:right w:val="single" w:color="BFBFBF" w:sz="4"/>
+            </w:tcBorders>
+            <w:shd w:fill="F2F2F2" w:color="auto" w:val="clear"/>
+            <w:tcMar>
+              <w:top w:type="dxa" w:w="80"/>
+              <w:left w:type="dxa" w:w="120"/>
+              <w:bottom w:type="dxa" w:w="80"/>
+              <w:right w:type="dxa" w:w="120"/>
+            </w:tcMar>
+          </w:tcPr>
+          <w:p>
+            <w:r>
+              <w:rPr>
+                <w:b w:val="false"/>
+                <w:bCs w:val="false"/>
+                <w:sz w:val="20"/>
+                <w:szCs w:val="20"/>
+              </w:rPr>
+              <w:t xml:space="preserve">Capsule Stage</w:t>
+            </w:r>
+          </w:p>
+        </w:tc>
+        <w:tc>
+          <w:tcPr>
+            <w:tcW w:type="dxa" w:w="3060"/>
+            <w:tcBorders>
+              <w:top w:val="single" w:color="BFBFBF" w:sz="4"/>
+              <w:left w:val="single" w:color="BFBFBF" w:sz="4"/>
+              <w:bottom w:val="single" w:color="BFBFBF" w:sz="4"/>
+              <w:right w:val="single" w:color="BFBFBF" w:sz="4"/>
+            </w:tcBorders>
+            <w:shd w:fill="F2F2F2" w:color="auto" w:val="clear"/>
+            <w:tcMar>
+              <w:top w:type="dxa" w:w="80"/>
+              <w:left w:type="dxa" w:w="120"/>
+              <w:bottom w:type="dxa" w:w="80"/>
+              <w:right w:type="dxa" w:w="120"/>
+            </w:tcMar>
+          </w:tcPr>
+          <w:p>
+            <w:r>
+              <w:rPr>
+                <w:b w:val="false"/>
+                <w:bCs w:val="false"/>
+                <w:sz w:val="20"/>
+                <w:szCs w:val="20"/>
+              </w:rPr>
+              <w:t xml:space="preserve">Groceryshop Key Takeaways</w:t>
+            </w:r>
+          </w:p>
+        </w:tc>
+        <w:tc>
+          <w:tcPr>
+            <w:tcW w:type="dxa" w:w="1400"/>
+            <w:tcBorders>
+              <w:top w:val="single" w:color="BFBFBF" w:sz="4"/>
+              <w:left w:val="single" w:color="BFBFBF" w:sz="4"/>
+              <w:bottom w:val="single" w:color="BFBFBF" w:sz="4"/>
+              <w:right w:val="single" w:color="BFBFBF" w:sz="4"/>
+            </w:tcBorders>
+            <w:shd w:fill="F2F2F2" w:color="auto" w:val="clear"/>
+            <w:tcMar>
+              <w:top w:type="dxa" w:w="80"/>
+              <w:left w:type="dxa" w:w="120"/>
+              <w:bottom w:type="dxa" w:w="80"/>
+              <w:right w:type="dxa" w:w="120"/>
+            </w:tcMar>
+          </w:tcPr>
+          <w:p>
+            <w:r>
+              <w:rPr>
+                <w:b w:val="false"/>
+                <w:bCs w:val="false"/>
+                <w:sz w:val="20"/>
+                <w:szCs w:val="20"/>
+              </w:rPr>
+              <w:t xml:space="preserve">Transcript included</w:t>
+            </w:r>
+          </w:p>
+        </w:tc>
+      </w:tr>
+      <w:tr>
+        <w:trPr>
+          <w:cantSplit/>
+        </w:trPr>
+        <w:tc>
+          <w:tcPr>
+            <w:tcW w:type="dxa" w:w="1500"/>
+            <w:tcBorders>
+              <w:top w:val="single" w:color="BFBFBF" w:sz="4"/>
+              <w:left w:val="single" w:color="BFBFBF" w:sz="4"/>
+              <w:bottom w:val="single" w:color="BFBFBF" w:sz="4"/>
+              <w:right w:val="single" w:color="BFBFBF" w:sz="4"/>
+            </w:tcBorders>
+            <w:tcMar>
+              <w:top w:type="dxa" w:w="80"/>
+              <w:left w:type="dxa" w:w="120"/>
+              <w:bottom w:type="dxa" w:w="80"/>
+              <w:right w:type="dxa" w:w="120"/>
+            </w:tcMar>
+          </w:tcPr>
+          <w:p>
+            <w:r>
+              <w:rPr>
+                <w:b w:val="false"/>
+                <w:bCs w:val="false"/>
+                <w:sz w:val="20"/>
+                <w:szCs w:val="20"/>
+              </w:rPr>
               <w:t xml:space="preserve">TBC</w:t>
             </w:r>
           </w:p>
@@ -938,7 +1233,7 @@
                 <w:sz w:val="20"/>
                 <w:szCs w:val="20"/>
               </w:rPr>
-              <w:t xml:space="preserve">Closing Session: Show Wrap-Up Panel</w:t>
+              <w:t xml:space="preserve">Title TBC: Women in the C-suite session</w:t>
             </w:r>
           </w:p>
         </w:tc>
@@ -966,7 +1261,7 @@
                 <w:sz w:val="20"/>
                 <w:szCs w:val="20"/>
               </w:rPr>
-              <w:t xml:space="preserve">Transcript included</w:t>
+              <w:t xml:space="preserve">Transcript to follow</w:t>
             </w:r>
           </w:p>
         </w:tc>
@@ -4142,7 +4437,7 @@
         <w:pStyle w:val="Heading1"/>
       </w:pPr>
       <w:r>
-        <w:t xml:space="preserve">Closing Session: Show Wrap-Up Panel</w:t>
+        <w:t xml:space="preserve">New Opportunities for 1:1 Personalization</w:t>
       </w:r>
     </w:p>
     <w:tbl>
@@ -4282,7 +4577,7 @@
                 <w:sz w:val="20"/>
                 <w:szCs w:val="20"/>
               </w:rPr>
-              <w:t xml:space="preserve">TBC</w:t>
+              <w:t xml:space="preserve">Thu, 24 Sep 2026</w:t>
             </w:r>
           </w:p>
         </w:tc>
@@ -4345,7 +4640,7 @@
                 <w:sz w:val="20"/>
                 <w:szCs w:val="20"/>
               </w:rPr>
-              <w:t xml:space="preserve">TBC</w:t>
+              <w:t xml:space="preserve">2:20 PM – 3:00 PM PT</w:t>
             </w:r>
           </w:p>
         </w:tc>
@@ -4406,7 +4701,7 @@
                 <w:sz w:val="20"/>
                 <w:szCs w:val="20"/>
               </w:rPr>
-              <w:t xml:space="preserve">TBC</w:t>
+              <w:t xml:space="preserve">Snackable Insights Stage</w:t>
             </w:r>
           </w:p>
         </w:tc>
@@ -4469,68 +4764,7 @@
                 <w:sz w:val="20"/>
                 <w:szCs w:val="20"/>
               </w:rPr>
-              <w:t xml:space="preserve">Transcript included</w:t>
-            </w:r>
-          </w:p>
-        </w:tc>
-      </w:tr>
-      <w:tr>
-        <w:trPr>
-          <w:cantSplit/>
-        </w:trPr>
-        <w:tc>
-          <w:tcPr>
-            <w:tcW w:type="dxa" w:w="2200"/>
-            <w:tcBorders>
-              <w:top w:val="single" w:color="BFBFBF" w:sz="4"/>
-              <w:left w:val="single" w:color="BFBFBF" w:sz="4"/>
-              <w:bottom w:val="single" w:color="BFBFBF" w:sz="4"/>
-              <w:right w:val="single" w:color="BFBFBF" w:sz="4"/>
-            </w:tcBorders>
-            <w:tcMar>
-              <w:top w:type="dxa" w:w="80"/>
-              <w:left w:type="dxa" w:w="120"/>
-              <w:bottom w:type="dxa" w:w="80"/>
-              <w:right w:type="dxa" w:w="120"/>
-            </w:tcMar>
-          </w:tcPr>
-          <w:p>
-            <w:r>
-              <w:rPr>
-                <w:b/>
-                <w:bCs/>
-                <w:sz w:val="20"/>
-                <w:szCs w:val="20"/>
-              </w:rPr>
-              <w:t xml:space="preserve">Title</w:t>
-            </w:r>
-          </w:p>
-        </w:tc>
-        <w:tc>
-          <w:tcPr>
-            <w:tcW w:type="dxa" w:w="7160"/>
-            <w:tcBorders>
-              <w:top w:val="single" w:color="BFBFBF" w:sz="4"/>
-              <w:left w:val="single" w:color="BFBFBF" w:sz="4"/>
-              <w:bottom w:val="single" w:color="BFBFBF" w:sz="4"/>
-              <w:right w:val="single" w:color="BFBFBF" w:sz="4"/>
-            </w:tcBorders>
-            <w:tcMar>
-              <w:top w:type="dxa" w:w="80"/>
-              <w:left w:type="dxa" w:w="120"/>
-              <w:bottom w:type="dxa" w:w="80"/>
-              <w:right w:type="dxa" w:w="120"/>
-            </w:tcMar>
-          </w:tcPr>
-          <w:p>
-            <w:r>
-              <w:rPr>
-                <w:b w:val="false"/>
-                <w:bCs w:val="false"/>
-                <w:sz w:val="20"/>
-                <w:szCs w:val="20"/>
-              </w:rPr>
-              <w:t xml:space="preserve">Working title from the recording; official session title, date, time and stage not yet provided</w:t>
+              <w:t xml:space="preserve">Transcript to follow</w:t>
             </w:r>
           </w:p>
         </w:tc>
@@ -4715,7 +4949,7 @@
                 <w:sz w:val="20"/>
                 <w:szCs w:val="20"/>
               </w:rPr>
-              <w:t xml:space="preserve">Ben Miller</w:t>
+              <w:t xml:space="preserve">Sabrina McPherson</w:t>
             </w:r>
           </w:p>
         </w:tc>
@@ -4771,7 +5005,7 @@
                 <w:sz w:val="20"/>
                 <w:szCs w:val="20"/>
               </w:rPr>
-              <w:t xml:space="preserve">Founder &amp; Host</w:t>
+              <w:t xml:space="preserve">SVP</w:t>
             </w:r>
           </w:p>
         </w:tc>
@@ -4799,7 +5033,7 @@
                 <w:sz w:val="20"/>
                 <w:szCs w:val="20"/>
               </w:rPr>
-              <w:t xml:space="preserve">The GrocerTalk Podcast</w:t>
+              <w:t xml:space="preserve">Publicis Sapient</w:t>
             </w:r>
           </w:p>
         </w:tc>
@@ -4833,7 +5067,7 @@
                 <w:sz w:val="20"/>
                 <w:szCs w:val="20"/>
               </w:rPr>
-              <w:t xml:space="preserve">Deborah Weinswig</w:t>
+              <w:t xml:space="preserve">Cristian Arcangeli</w:t>
             </w:r>
           </w:p>
         </w:tc>
@@ -4891,7 +5125,7 @@
                 <w:sz w:val="20"/>
                 <w:szCs w:val="20"/>
               </w:rPr>
-              <w:t xml:space="preserve">Founder &amp; CEO</w:t>
+              <w:t xml:space="preserve">VP, Marketing, Strategy &amp; Digital B... (truncated in app)</w:t>
             </w:r>
           </w:p>
         </w:tc>
@@ -4920,7 +5154,7 @@
                 <w:sz w:val="20"/>
                 <w:szCs w:val="20"/>
               </w:rPr>
-              <w:t xml:space="preserve">Coresight Research</w:t>
+              <w:t xml:space="preserve">Illy Caffè</w:t>
             </w:r>
           </w:p>
         </w:tc>
@@ -4953,7 +5187,7 @@
                 <w:sz w:val="20"/>
                 <w:szCs w:val="20"/>
               </w:rPr>
-              <w:t xml:space="preserve">Kelli</w:t>
+              <w:t xml:space="preserve">Harshad Agashe</w:t>
             </w:r>
           </w:p>
         </w:tc>
@@ -5009,7 +5243,7 @@
                 <w:sz w:val="20"/>
                 <w:szCs w:val="20"/>
               </w:rPr>
-              <w:t xml:space="preserve">Content Director</w:t>
+              <w:t xml:space="preserve">VP Data &amp; Data Science product... (truncated in app)</w:t>
             </w:r>
           </w:p>
         </w:tc>
@@ -5037,7 +5271,7 @@
                 <w:sz w:val="20"/>
                 <w:szCs w:val="20"/>
               </w:rPr>
-              <w:t xml:space="preserve">Groceryshop</w:t>
+              <w:t xml:space="preserve">Albertsons Companies</w:t>
             </w:r>
           </w:p>
         </w:tc>
@@ -5071,6 +5305,1010 @@
                 <w:sz w:val="20"/>
                 <w:szCs w:val="20"/>
               </w:rPr>
+              <w:t xml:space="preserve">Nick Hamilton</w:t>
+            </w:r>
+          </w:p>
+        </w:tc>
+        <w:tc>
+          <w:tcPr>
+            <w:tcW w:type="dxa" w:w="1400"/>
+            <w:tcBorders>
+              <w:top w:val="single" w:color="BFBFBF" w:sz="4"/>
+              <w:left w:val="single" w:color="BFBFBF" w:sz="4"/>
+              <w:bottom w:val="single" w:color="BFBFBF" w:sz="4"/>
+              <w:right w:val="single" w:color="BFBFBF" w:sz="4"/>
+            </w:tcBorders>
+            <w:shd w:fill="F2F2F2" w:color="auto" w:val="clear"/>
+            <w:tcMar>
+              <w:top w:type="dxa" w:w="80"/>
+              <w:left w:type="dxa" w:w="120"/>
+              <w:bottom w:type="dxa" w:w="80"/>
+              <w:right w:type="dxa" w:w="120"/>
+            </w:tcMar>
+          </w:tcPr>
+          <w:p>
+            <w:r>
+              <w:rPr>
+                <w:b w:val="false"/>
+                <w:bCs w:val="false"/>
+                <w:sz w:val="20"/>
+                <w:szCs w:val="20"/>
+              </w:rPr>
+              <w:t xml:space="preserve">Panelist</w:t>
+            </w:r>
+          </w:p>
+        </w:tc>
+        <w:tc>
+          <w:tcPr>
+            <w:tcW w:type="dxa" w:w="3160"/>
+            <w:tcBorders>
+              <w:top w:val="single" w:color="BFBFBF" w:sz="4"/>
+              <w:left w:val="single" w:color="BFBFBF" w:sz="4"/>
+              <w:bottom w:val="single" w:color="BFBFBF" w:sz="4"/>
+              <w:right w:val="single" w:color="BFBFBF" w:sz="4"/>
+            </w:tcBorders>
+            <w:shd w:fill="F2F2F2" w:color="auto" w:val="clear"/>
+            <w:tcMar>
+              <w:top w:type="dxa" w:w="80"/>
+              <w:left w:type="dxa" w:w="120"/>
+              <w:bottom w:type="dxa" w:w="80"/>
+              <w:right w:type="dxa" w:w="120"/>
+            </w:tcMar>
+          </w:tcPr>
+          <w:p>
+            <w:r>
+              <w:rPr>
+                <w:b w:val="false"/>
+                <w:bCs w:val="false"/>
+                <w:sz w:val="20"/>
+                <w:szCs w:val="20"/>
+              </w:rPr>
+              <w:t xml:space="preserve">SVP, Technology</w:t>
+            </w:r>
+          </w:p>
+        </w:tc>
+        <w:tc>
+          <w:tcPr>
+            <w:tcW w:type="dxa" w:w="2600"/>
+            <w:tcBorders>
+              <w:top w:val="single" w:color="BFBFBF" w:sz="4"/>
+              <w:left w:val="single" w:color="BFBFBF" w:sz="4"/>
+              <w:bottom w:val="single" w:color="BFBFBF" w:sz="4"/>
+              <w:right w:val="single" w:color="BFBFBF" w:sz="4"/>
+            </w:tcBorders>
+            <w:shd w:fill="F2F2F2" w:color="auto" w:val="clear"/>
+            <w:tcMar>
+              <w:top w:type="dxa" w:w="80"/>
+              <w:left w:type="dxa" w:w="120"/>
+              <w:bottom w:type="dxa" w:w="80"/>
+              <w:right w:type="dxa" w:w="120"/>
+            </w:tcMar>
+          </w:tcPr>
+          <w:p>
+            <w:r>
+              <w:rPr>
+                <w:b w:val="false"/>
+                <w:bCs w:val="false"/>
+                <w:sz w:val="20"/>
+                <w:szCs w:val="20"/>
+              </w:rPr>
+              <w:t xml:space="preserve">Kroger Precision Marketing</w:t>
+            </w:r>
+          </w:p>
+        </w:tc>
+      </w:tr>
+    </w:tbl>
+    <w:p>
+      <w:pPr>
+        <w:pStyle w:val="Heading2"/>
+      </w:pPr>
+      <w:r>
+        <w:t xml:space="preserve">Transcript</w:t>
+      </w:r>
+    </w:p>
+    <w:p>
+      <w:pPr>
+        <w:spacing w:after="120"/>
+      </w:pPr>
+      <w:r>
+        <w:rPr>
+          <w:i/>
+          <w:iCs/>
+          <w:color w:val="7F7F7F"/>
+        </w:rPr>
+        <w:t xml:space="preserve">Transcript to follow.</w:t>
+      </w:r>
+    </w:p>
+    <w:p>
+      <w:pPr>
+        <w:pageBreakBefore/>
+        <w:spacing w:after="60"/>
+      </w:pPr>
+      <w:r>
+        <w:rPr>
+          <w:b/>
+          <w:bCs/>
+          <w:color w:val="7F7F7F"/>
+          <w:spacing w:val="40"/>
+          <w:sz w:val="18"/>
+          <w:szCs w:val="18"/>
+        </w:rPr>
+        <w:t xml:space="preserve">SESSION 6</w:t>
+      </w:r>
+    </w:p>
+    <w:p>
+      <w:pPr>
+        <w:pStyle w:val="Heading1"/>
+      </w:pPr>
+      <w:r>
+        <w:t xml:space="preserve">Groceryshop Key Takeaways</w:t>
+      </w:r>
+    </w:p>
+    <w:tbl>
+      <w:tblPr>
+        <w:tblW w:type="dxa" w:w="9360"/>
+        <w:tblBorders>
+          <w:top w:val="single" w:color="auto" w:sz="4"/>
+          <w:left w:val="single" w:color="auto" w:sz="4"/>
+          <w:bottom w:val="single" w:color="auto" w:sz="4"/>
+          <w:right w:val="single" w:color="auto" w:sz="4"/>
+          <w:insideH w:val="single" w:color="auto" w:sz="4"/>
+          <w:insideV w:val="single" w:color="auto" w:sz="4"/>
+        </w:tblBorders>
+      </w:tblPr>
+      <w:tblGrid>
+        <w:gridCol w:w="2200"/>
+        <w:gridCol w:w="7160"/>
+      </w:tblGrid>
+      <w:tr>
+        <w:trPr>
+          <w:tblHeader/>
+        </w:trPr>
+        <w:tc>
+          <w:tcPr>
+            <w:tcW w:type="dxa" w:w="2200"/>
+            <w:tcBorders>
+              <w:top w:val="single" w:color="BFBFBF" w:sz="4"/>
+              <w:left w:val="single" w:color="BFBFBF" w:sz="4"/>
+              <w:bottom w:val="single" w:color="BFBFBF" w:sz="4"/>
+              <w:right w:val="single" w:color="BFBFBF" w:sz="4"/>
+            </w:tcBorders>
+            <w:shd w:fill="1F4E79" w:color="auto" w:val="clear"/>
+            <w:tcMar>
+              <w:top w:type="dxa" w:w="80"/>
+              <w:left w:type="dxa" w:w="120"/>
+              <w:bottom w:type="dxa" w:w="80"/>
+              <w:right w:type="dxa" w:w="120"/>
+            </w:tcMar>
+          </w:tcPr>
+          <w:p>
+            <w:r>
+              <w:rPr>
+                <w:b/>
+                <w:bCs/>
+                <w:color w:val="FFFFFF"/>
+                <w:sz w:val="20"/>
+                <w:szCs w:val="20"/>
+              </w:rPr>
+              <w:t xml:space="preserve">Session Details</w:t>
+            </w:r>
+          </w:p>
+        </w:tc>
+        <w:tc>
+          <w:tcPr>
+            <w:tcW w:type="dxa" w:w="7160"/>
+            <w:tcBorders>
+              <w:top w:val="single" w:color="BFBFBF" w:sz="4"/>
+              <w:left w:val="single" w:color="BFBFBF" w:sz="4"/>
+              <w:bottom w:val="single" w:color="BFBFBF" w:sz="4"/>
+              <w:right w:val="single" w:color="BFBFBF" w:sz="4"/>
+            </w:tcBorders>
+            <w:shd w:fill="1F4E79" w:color="auto" w:val="clear"/>
+            <w:tcMar>
+              <w:top w:type="dxa" w:w="80"/>
+              <w:left w:type="dxa" w:w="120"/>
+              <w:bottom w:type="dxa" w:w="80"/>
+              <w:right w:type="dxa" w:w="120"/>
+            </w:tcMar>
+          </w:tcPr>
+          <w:p>
+            <w:r>
+              <w:rPr>
+                <w:b/>
+                <w:bCs/>
+                <w:color w:val="FFFFFF"/>
+                <w:sz w:val="20"/>
+                <w:szCs w:val="20"/>
+              </w:rPr>
+              <w:t xml:space="preserve"/>
+            </w:r>
+          </w:p>
+        </w:tc>
+      </w:tr>
+      <w:tr>
+        <w:trPr>
+          <w:cantSplit/>
+        </w:trPr>
+        <w:tc>
+          <w:tcPr>
+            <w:tcW w:type="dxa" w:w="2200"/>
+            <w:tcBorders>
+              <w:top w:val="single" w:color="BFBFBF" w:sz="4"/>
+              <w:left w:val="single" w:color="BFBFBF" w:sz="4"/>
+              <w:bottom w:val="single" w:color="BFBFBF" w:sz="4"/>
+              <w:right w:val="single" w:color="BFBFBF" w:sz="4"/>
+            </w:tcBorders>
+            <w:tcMar>
+              <w:top w:type="dxa" w:w="80"/>
+              <w:left w:type="dxa" w:w="120"/>
+              <w:bottom w:type="dxa" w:w="80"/>
+              <w:right w:type="dxa" w:w="120"/>
+            </w:tcMar>
+          </w:tcPr>
+          <w:p>
+            <w:r>
+              <w:rPr>
+                <w:b/>
+                <w:bCs/>
+                <w:sz w:val="20"/>
+                <w:szCs w:val="20"/>
+              </w:rPr>
+              <w:t xml:space="preserve">Date</w:t>
+            </w:r>
+          </w:p>
+        </w:tc>
+        <w:tc>
+          <w:tcPr>
+            <w:tcW w:type="dxa" w:w="7160"/>
+            <w:tcBorders>
+              <w:top w:val="single" w:color="BFBFBF" w:sz="4"/>
+              <w:left w:val="single" w:color="BFBFBF" w:sz="4"/>
+              <w:bottom w:val="single" w:color="BFBFBF" w:sz="4"/>
+              <w:right w:val="single" w:color="BFBFBF" w:sz="4"/>
+            </w:tcBorders>
+            <w:tcMar>
+              <w:top w:type="dxa" w:w="80"/>
+              <w:left w:type="dxa" w:w="120"/>
+              <w:bottom w:type="dxa" w:w="80"/>
+              <w:right w:type="dxa" w:w="120"/>
+            </w:tcMar>
+          </w:tcPr>
+          <w:p>
+            <w:r>
+              <w:rPr>
+                <w:b w:val="false"/>
+                <w:bCs w:val="false"/>
+                <w:sz w:val="20"/>
+                <w:szCs w:val="20"/>
+              </w:rPr>
+              <w:t xml:space="preserve">Thu, 24 Sep 2026</w:t>
+            </w:r>
+          </w:p>
+        </w:tc>
+      </w:tr>
+      <w:tr>
+        <w:trPr>
+          <w:cantSplit/>
+        </w:trPr>
+        <w:tc>
+          <w:tcPr>
+            <w:tcW w:type="dxa" w:w="2200"/>
+            <w:tcBorders>
+              <w:top w:val="single" w:color="BFBFBF" w:sz="4"/>
+              <w:left w:val="single" w:color="BFBFBF" w:sz="4"/>
+              <w:bottom w:val="single" w:color="BFBFBF" w:sz="4"/>
+              <w:right w:val="single" w:color="BFBFBF" w:sz="4"/>
+            </w:tcBorders>
+            <w:shd w:fill="F2F2F2" w:color="auto" w:val="clear"/>
+            <w:tcMar>
+              <w:top w:type="dxa" w:w="80"/>
+              <w:left w:type="dxa" w:w="120"/>
+              <w:bottom w:type="dxa" w:w="80"/>
+              <w:right w:type="dxa" w:w="120"/>
+            </w:tcMar>
+          </w:tcPr>
+          <w:p>
+            <w:r>
+              <w:rPr>
+                <w:b/>
+                <w:bCs/>
+                <w:sz w:val="20"/>
+                <w:szCs w:val="20"/>
+              </w:rPr>
+              <w:t xml:space="preserve">Time</w:t>
+            </w:r>
+          </w:p>
+        </w:tc>
+        <w:tc>
+          <w:tcPr>
+            <w:tcW w:type="dxa" w:w="7160"/>
+            <w:tcBorders>
+              <w:top w:val="single" w:color="BFBFBF" w:sz="4"/>
+              <w:left w:val="single" w:color="BFBFBF" w:sz="4"/>
+              <w:bottom w:val="single" w:color="BFBFBF" w:sz="4"/>
+              <w:right w:val="single" w:color="BFBFBF" w:sz="4"/>
+            </w:tcBorders>
+            <w:shd w:fill="F2F2F2" w:color="auto" w:val="clear"/>
+            <w:tcMar>
+              <w:top w:type="dxa" w:w="80"/>
+              <w:left w:type="dxa" w:w="120"/>
+              <w:bottom w:type="dxa" w:w="80"/>
+              <w:right w:type="dxa" w:w="120"/>
+            </w:tcMar>
+          </w:tcPr>
+          <w:p>
+            <w:r>
+              <w:rPr>
+                <w:b w:val="false"/>
+                <w:bCs w:val="false"/>
+                <w:sz w:val="20"/>
+                <w:szCs w:val="20"/>
+              </w:rPr>
+              <w:t xml:space="preserve">3:10 PM – 3:50 PM PT</w:t>
+            </w:r>
+          </w:p>
+        </w:tc>
+      </w:tr>
+      <w:tr>
+        <w:trPr>
+          <w:cantSplit/>
+        </w:trPr>
+        <w:tc>
+          <w:tcPr>
+            <w:tcW w:type="dxa" w:w="2200"/>
+            <w:tcBorders>
+              <w:top w:val="single" w:color="BFBFBF" w:sz="4"/>
+              <w:left w:val="single" w:color="BFBFBF" w:sz="4"/>
+              <w:bottom w:val="single" w:color="BFBFBF" w:sz="4"/>
+              <w:right w:val="single" w:color="BFBFBF" w:sz="4"/>
+            </w:tcBorders>
+            <w:tcMar>
+              <w:top w:type="dxa" w:w="80"/>
+              <w:left w:type="dxa" w:w="120"/>
+              <w:bottom w:type="dxa" w:w="80"/>
+              <w:right w:type="dxa" w:w="120"/>
+            </w:tcMar>
+          </w:tcPr>
+          <w:p>
+            <w:r>
+              <w:rPr>
+                <w:b/>
+                <w:bCs/>
+                <w:sz w:val="20"/>
+                <w:szCs w:val="20"/>
+              </w:rPr>
+              <w:t xml:space="preserve">Stage</w:t>
+            </w:r>
+          </w:p>
+        </w:tc>
+        <w:tc>
+          <w:tcPr>
+            <w:tcW w:type="dxa" w:w="7160"/>
+            <w:tcBorders>
+              <w:top w:val="single" w:color="BFBFBF" w:sz="4"/>
+              <w:left w:val="single" w:color="BFBFBF" w:sz="4"/>
+              <w:bottom w:val="single" w:color="BFBFBF" w:sz="4"/>
+              <w:right w:val="single" w:color="BFBFBF" w:sz="4"/>
+            </w:tcBorders>
+            <w:tcMar>
+              <w:top w:type="dxa" w:w="80"/>
+              <w:left w:type="dxa" w:w="120"/>
+              <w:bottom w:type="dxa" w:w="80"/>
+              <w:right w:type="dxa" w:w="120"/>
+            </w:tcMar>
+          </w:tcPr>
+          <w:p>
+            <w:r>
+              <w:rPr>
+                <w:b w:val="false"/>
+                <w:bCs w:val="false"/>
+                <w:sz w:val="20"/>
+                <w:szCs w:val="20"/>
+              </w:rPr>
+              <w:t xml:space="preserve">Capsule Stage</w:t>
+            </w:r>
+          </w:p>
+        </w:tc>
+      </w:tr>
+      <w:tr>
+        <w:trPr>
+          <w:cantSplit/>
+        </w:trPr>
+        <w:tc>
+          <w:tcPr>
+            <w:tcW w:type="dxa" w:w="2200"/>
+            <w:tcBorders>
+              <w:top w:val="single" w:color="BFBFBF" w:sz="4"/>
+              <w:left w:val="single" w:color="BFBFBF" w:sz="4"/>
+              <w:bottom w:val="single" w:color="BFBFBF" w:sz="4"/>
+              <w:right w:val="single" w:color="BFBFBF" w:sz="4"/>
+            </w:tcBorders>
+            <w:shd w:fill="F2F2F2" w:color="auto" w:val="clear"/>
+            <w:tcMar>
+              <w:top w:type="dxa" w:w="80"/>
+              <w:left w:type="dxa" w:w="120"/>
+              <w:bottom w:type="dxa" w:w="80"/>
+              <w:right w:type="dxa" w:w="120"/>
+            </w:tcMar>
+          </w:tcPr>
+          <w:p>
+            <w:r>
+              <w:rPr>
+                <w:b/>
+                <w:bCs/>
+                <w:sz w:val="20"/>
+                <w:szCs w:val="20"/>
+              </w:rPr>
+              <w:t xml:space="preserve">Notes</w:t>
+            </w:r>
+          </w:p>
+        </w:tc>
+        <w:tc>
+          <w:tcPr>
+            <w:tcW w:type="dxa" w:w="7160"/>
+            <w:tcBorders>
+              <w:top w:val="single" w:color="BFBFBF" w:sz="4"/>
+              <w:left w:val="single" w:color="BFBFBF" w:sz="4"/>
+              <w:bottom w:val="single" w:color="BFBFBF" w:sz="4"/>
+              <w:right w:val="single" w:color="BFBFBF" w:sz="4"/>
+            </w:tcBorders>
+            <w:shd w:fill="F2F2F2" w:color="auto" w:val="clear"/>
+            <w:tcMar>
+              <w:top w:type="dxa" w:w="80"/>
+              <w:left w:type="dxa" w:w="120"/>
+              <w:bottom w:type="dxa" w:w="80"/>
+              <w:right w:type="dxa" w:w="120"/>
+            </w:tcMar>
+          </w:tcPr>
+          <w:p>
+            <w:r>
+              <w:rPr>
+                <w:b w:val="false"/>
+                <w:bCs w:val="false"/>
+                <w:sz w:val="20"/>
+                <w:szCs w:val="20"/>
+              </w:rPr>
+              <w:t xml:space="preserve">Transcript included</w:t>
+            </w:r>
+          </w:p>
+        </w:tc>
+      </w:tr>
+    </w:tbl>
+    <w:p>
+      <w:pPr>
+        <w:pStyle w:val="Heading2"/>
+      </w:pPr>
+      <w:r>
+        <w:t xml:space="preserve">Speakers</w:t>
+      </w:r>
+    </w:p>
+    <w:tbl>
+      <w:tblPr>
+        <w:tblW w:type="dxa" w:w="9360"/>
+        <w:tblBorders>
+          <w:top w:val="single" w:color="auto" w:sz="4"/>
+          <w:left w:val="single" w:color="auto" w:sz="4"/>
+          <w:bottom w:val="single" w:color="auto" w:sz="4"/>
+          <w:right w:val="single" w:color="auto" w:sz="4"/>
+          <w:insideH w:val="single" w:color="auto" w:sz="4"/>
+          <w:insideV w:val="single" w:color="auto" w:sz="4"/>
+        </w:tblBorders>
+      </w:tblPr>
+      <w:tblGrid>
+        <w:gridCol w:w="2200"/>
+        <w:gridCol w:w="1400"/>
+        <w:gridCol w:w="3160"/>
+        <w:gridCol w:w="2600"/>
+      </w:tblGrid>
+      <w:tr>
+        <w:trPr>
+          <w:tblHeader/>
+        </w:trPr>
+        <w:tc>
+          <w:tcPr>
+            <w:tcW w:type="dxa" w:w="2200"/>
+            <w:tcBorders>
+              <w:top w:val="single" w:color="BFBFBF" w:sz="4"/>
+              <w:left w:val="single" w:color="BFBFBF" w:sz="4"/>
+              <w:bottom w:val="single" w:color="BFBFBF" w:sz="4"/>
+              <w:right w:val="single" w:color="BFBFBF" w:sz="4"/>
+            </w:tcBorders>
+            <w:shd w:fill="1F4E79" w:color="auto" w:val="clear"/>
+            <w:tcMar>
+              <w:top w:type="dxa" w:w="80"/>
+              <w:left w:type="dxa" w:w="120"/>
+              <w:bottom w:type="dxa" w:w="80"/>
+              <w:right w:type="dxa" w:w="120"/>
+            </w:tcMar>
+          </w:tcPr>
+          <w:p>
+            <w:r>
+              <w:rPr>
+                <w:b/>
+                <w:bCs/>
+                <w:color w:val="FFFFFF"/>
+                <w:sz w:val="20"/>
+                <w:szCs w:val="20"/>
+              </w:rPr>
+              <w:t xml:space="preserve">Name</w:t>
+            </w:r>
+          </w:p>
+        </w:tc>
+        <w:tc>
+          <w:tcPr>
+            <w:tcW w:type="dxa" w:w="1400"/>
+            <w:tcBorders>
+              <w:top w:val="single" w:color="BFBFBF" w:sz="4"/>
+              <w:left w:val="single" w:color="BFBFBF" w:sz="4"/>
+              <w:bottom w:val="single" w:color="BFBFBF" w:sz="4"/>
+              <w:right w:val="single" w:color="BFBFBF" w:sz="4"/>
+            </w:tcBorders>
+            <w:shd w:fill="1F4E79" w:color="auto" w:val="clear"/>
+            <w:tcMar>
+              <w:top w:type="dxa" w:w="80"/>
+              <w:left w:type="dxa" w:w="120"/>
+              <w:bottom w:type="dxa" w:w="80"/>
+              <w:right w:type="dxa" w:w="120"/>
+            </w:tcMar>
+          </w:tcPr>
+          <w:p>
+            <w:r>
+              <w:rPr>
+                <w:b/>
+                <w:bCs/>
+                <w:color w:val="FFFFFF"/>
+                <w:sz w:val="20"/>
+                <w:szCs w:val="20"/>
+              </w:rPr>
+              <w:t xml:space="preserve">Role</w:t>
+            </w:r>
+          </w:p>
+        </w:tc>
+        <w:tc>
+          <w:tcPr>
+            <w:tcW w:type="dxa" w:w="3160"/>
+            <w:tcBorders>
+              <w:top w:val="single" w:color="BFBFBF" w:sz="4"/>
+              <w:left w:val="single" w:color="BFBFBF" w:sz="4"/>
+              <w:bottom w:val="single" w:color="BFBFBF" w:sz="4"/>
+              <w:right w:val="single" w:color="BFBFBF" w:sz="4"/>
+            </w:tcBorders>
+            <w:shd w:fill="1F4E79" w:color="auto" w:val="clear"/>
+            <w:tcMar>
+              <w:top w:type="dxa" w:w="80"/>
+              <w:left w:type="dxa" w:w="120"/>
+              <w:bottom w:type="dxa" w:w="80"/>
+              <w:right w:type="dxa" w:w="120"/>
+            </w:tcMar>
+          </w:tcPr>
+          <w:p>
+            <w:r>
+              <w:rPr>
+                <w:b/>
+                <w:bCs/>
+                <w:color w:val="FFFFFF"/>
+                <w:sz w:val="20"/>
+                <w:szCs w:val="20"/>
+              </w:rPr>
+              <w:t xml:space="preserve">Title</w:t>
+            </w:r>
+          </w:p>
+        </w:tc>
+        <w:tc>
+          <w:tcPr>
+            <w:tcW w:type="dxa" w:w="2600"/>
+            <w:tcBorders>
+              <w:top w:val="single" w:color="BFBFBF" w:sz="4"/>
+              <w:left w:val="single" w:color="BFBFBF" w:sz="4"/>
+              <w:bottom w:val="single" w:color="BFBFBF" w:sz="4"/>
+              <w:right w:val="single" w:color="BFBFBF" w:sz="4"/>
+            </w:tcBorders>
+            <w:shd w:fill="1F4E79" w:color="auto" w:val="clear"/>
+            <w:tcMar>
+              <w:top w:type="dxa" w:w="80"/>
+              <w:left w:type="dxa" w:w="120"/>
+              <w:bottom w:type="dxa" w:w="80"/>
+              <w:right w:type="dxa" w:w="120"/>
+            </w:tcMar>
+          </w:tcPr>
+          <w:p>
+            <w:r>
+              <w:rPr>
+                <w:b/>
+                <w:bCs/>
+                <w:color w:val="FFFFFF"/>
+                <w:sz w:val="20"/>
+                <w:szCs w:val="20"/>
+              </w:rPr>
+              <w:t xml:space="preserve">Organisation</w:t>
+            </w:r>
+          </w:p>
+        </w:tc>
+      </w:tr>
+      <w:tr>
+        <w:trPr>
+          <w:cantSplit/>
+        </w:trPr>
+        <w:tc>
+          <w:tcPr>
+            <w:tcW w:type="dxa" w:w="2200"/>
+            <w:tcBorders>
+              <w:top w:val="single" w:color="BFBFBF" w:sz="4"/>
+              <w:left w:val="single" w:color="BFBFBF" w:sz="4"/>
+              <w:bottom w:val="single" w:color="BFBFBF" w:sz="4"/>
+              <w:right w:val="single" w:color="BFBFBF" w:sz="4"/>
+            </w:tcBorders>
+            <w:tcMar>
+              <w:top w:type="dxa" w:w="80"/>
+              <w:left w:type="dxa" w:w="120"/>
+              <w:bottom w:type="dxa" w:w="80"/>
+              <w:right w:type="dxa" w:w="120"/>
+            </w:tcMar>
+          </w:tcPr>
+          <w:p>
+            <w:r>
+              <w:rPr>
+                <w:b w:val="false"/>
+                <w:bCs w:val="false"/>
+                <w:sz w:val="20"/>
+                <w:szCs w:val="20"/>
+              </w:rPr>
+              <w:t xml:space="preserve">Ben Miller</w:t>
+            </w:r>
+          </w:p>
+        </w:tc>
+        <w:tc>
+          <w:tcPr>
+            <w:tcW w:type="dxa" w:w="1400"/>
+            <w:tcBorders>
+              <w:top w:val="single" w:color="BFBFBF" w:sz="4"/>
+              <w:left w:val="single" w:color="BFBFBF" w:sz="4"/>
+              <w:bottom w:val="single" w:color="BFBFBF" w:sz="4"/>
+              <w:right w:val="single" w:color="BFBFBF" w:sz="4"/>
+            </w:tcBorders>
+            <w:tcMar>
+              <w:top w:type="dxa" w:w="80"/>
+              <w:left w:type="dxa" w:w="120"/>
+              <w:bottom w:type="dxa" w:w="80"/>
+              <w:right w:type="dxa" w:w="120"/>
+            </w:tcMar>
+          </w:tcPr>
+          <w:p>
+            <w:r>
+              <w:rPr>
+                <w:b w:val="false"/>
+                <w:bCs w:val="false"/>
+                <w:sz w:val="20"/>
+                <w:szCs w:val="20"/>
+              </w:rPr>
+              <w:t xml:space="preserve">Moderator</w:t>
+            </w:r>
+          </w:p>
+        </w:tc>
+        <w:tc>
+          <w:tcPr>
+            <w:tcW w:type="dxa" w:w="3160"/>
+            <w:tcBorders>
+              <w:top w:val="single" w:color="BFBFBF" w:sz="4"/>
+              <w:left w:val="single" w:color="BFBFBF" w:sz="4"/>
+              <w:bottom w:val="single" w:color="BFBFBF" w:sz="4"/>
+              <w:right w:val="single" w:color="BFBFBF" w:sz="4"/>
+            </w:tcBorders>
+            <w:tcMar>
+              <w:top w:type="dxa" w:w="80"/>
+              <w:left w:type="dxa" w:w="120"/>
+              <w:bottom w:type="dxa" w:w="80"/>
+              <w:right w:type="dxa" w:w="120"/>
+            </w:tcMar>
+          </w:tcPr>
+          <w:p>
+            <w:r>
+              <w:rPr>
+                <w:b w:val="false"/>
+                <w:bCs w:val="false"/>
+                <w:sz w:val="20"/>
+                <w:szCs w:val="20"/>
+              </w:rPr>
+              <w:t xml:space="preserve">Founder &amp; Host</w:t>
+            </w:r>
+          </w:p>
+        </w:tc>
+        <w:tc>
+          <w:tcPr>
+            <w:tcW w:type="dxa" w:w="2600"/>
+            <w:tcBorders>
+              <w:top w:val="single" w:color="BFBFBF" w:sz="4"/>
+              <w:left w:val="single" w:color="BFBFBF" w:sz="4"/>
+              <w:bottom w:val="single" w:color="BFBFBF" w:sz="4"/>
+              <w:right w:val="single" w:color="BFBFBF" w:sz="4"/>
+            </w:tcBorders>
+            <w:tcMar>
+              <w:top w:type="dxa" w:w="80"/>
+              <w:left w:type="dxa" w:w="120"/>
+              <w:bottom w:type="dxa" w:w="80"/>
+              <w:right w:type="dxa" w:w="120"/>
+            </w:tcMar>
+          </w:tcPr>
+          <w:p>
+            <w:r>
+              <w:rPr>
+                <w:b w:val="false"/>
+                <w:bCs w:val="false"/>
+                <w:sz w:val="20"/>
+                <w:szCs w:val="20"/>
+              </w:rPr>
+              <w:t xml:space="preserve">The GrocerTalk Podcast</w:t>
+            </w:r>
+          </w:p>
+        </w:tc>
+      </w:tr>
+      <w:tr>
+        <w:trPr>
+          <w:cantSplit/>
+        </w:trPr>
+        <w:tc>
+          <w:tcPr>
+            <w:tcW w:type="dxa" w:w="2200"/>
+            <w:tcBorders>
+              <w:top w:val="single" w:color="BFBFBF" w:sz="4"/>
+              <w:left w:val="single" w:color="BFBFBF" w:sz="4"/>
+              <w:bottom w:val="single" w:color="BFBFBF" w:sz="4"/>
+              <w:right w:val="single" w:color="BFBFBF" w:sz="4"/>
+            </w:tcBorders>
+            <w:shd w:fill="F2F2F2" w:color="auto" w:val="clear"/>
+            <w:tcMar>
+              <w:top w:type="dxa" w:w="80"/>
+              <w:left w:type="dxa" w:w="120"/>
+              <w:bottom w:type="dxa" w:w="80"/>
+              <w:right w:type="dxa" w:w="120"/>
+            </w:tcMar>
+          </w:tcPr>
+          <w:p>
+            <w:r>
+              <w:rPr>
+                <w:b w:val="false"/>
+                <w:bCs w:val="false"/>
+                <w:sz w:val="20"/>
+                <w:szCs w:val="20"/>
+              </w:rPr>
+              <w:t xml:space="preserve">Deborah Weinswig</w:t>
+            </w:r>
+          </w:p>
+        </w:tc>
+        <w:tc>
+          <w:tcPr>
+            <w:tcW w:type="dxa" w:w="1400"/>
+            <w:tcBorders>
+              <w:top w:val="single" w:color="BFBFBF" w:sz="4"/>
+              <w:left w:val="single" w:color="BFBFBF" w:sz="4"/>
+              <w:bottom w:val="single" w:color="BFBFBF" w:sz="4"/>
+              <w:right w:val="single" w:color="BFBFBF" w:sz="4"/>
+            </w:tcBorders>
+            <w:shd w:fill="F2F2F2" w:color="auto" w:val="clear"/>
+            <w:tcMar>
+              <w:top w:type="dxa" w:w="80"/>
+              <w:left w:type="dxa" w:w="120"/>
+              <w:bottom w:type="dxa" w:w="80"/>
+              <w:right w:type="dxa" w:w="120"/>
+            </w:tcMar>
+          </w:tcPr>
+          <w:p>
+            <w:r>
+              <w:rPr>
+                <w:b w:val="false"/>
+                <w:bCs w:val="false"/>
+                <w:sz w:val="20"/>
+                <w:szCs w:val="20"/>
+              </w:rPr>
+              <w:t xml:space="preserve">Panelist</w:t>
+            </w:r>
+          </w:p>
+        </w:tc>
+        <w:tc>
+          <w:tcPr>
+            <w:tcW w:type="dxa" w:w="3160"/>
+            <w:tcBorders>
+              <w:top w:val="single" w:color="BFBFBF" w:sz="4"/>
+              <w:left w:val="single" w:color="BFBFBF" w:sz="4"/>
+              <w:bottom w:val="single" w:color="BFBFBF" w:sz="4"/>
+              <w:right w:val="single" w:color="BFBFBF" w:sz="4"/>
+            </w:tcBorders>
+            <w:shd w:fill="F2F2F2" w:color="auto" w:val="clear"/>
+            <w:tcMar>
+              <w:top w:type="dxa" w:w="80"/>
+              <w:left w:type="dxa" w:w="120"/>
+              <w:bottom w:type="dxa" w:w="80"/>
+              <w:right w:type="dxa" w:w="120"/>
+            </w:tcMar>
+          </w:tcPr>
+          <w:p>
+            <w:r>
+              <w:rPr>
+                <w:b w:val="false"/>
+                <w:bCs w:val="false"/>
+                <w:sz w:val="20"/>
+                <w:szCs w:val="20"/>
+              </w:rPr>
+              <w:t xml:space="preserve">Founder &amp; CEO</w:t>
+            </w:r>
+          </w:p>
+        </w:tc>
+        <w:tc>
+          <w:tcPr>
+            <w:tcW w:type="dxa" w:w="2600"/>
+            <w:tcBorders>
+              <w:top w:val="single" w:color="BFBFBF" w:sz="4"/>
+              <w:left w:val="single" w:color="BFBFBF" w:sz="4"/>
+              <w:bottom w:val="single" w:color="BFBFBF" w:sz="4"/>
+              <w:right w:val="single" w:color="BFBFBF" w:sz="4"/>
+            </w:tcBorders>
+            <w:shd w:fill="F2F2F2" w:color="auto" w:val="clear"/>
+            <w:tcMar>
+              <w:top w:type="dxa" w:w="80"/>
+              <w:left w:type="dxa" w:w="120"/>
+              <w:bottom w:type="dxa" w:w="80"/>
+              <w:right w:type="dxa" w:w="120"/>
+            </w:tcMar>
+          </w:tcPr>
+          <w:p>
+            <w:r>
+              <w:rPr>
+                <w:b w:val="false"/>
+                <w:bCs w:val="false"/>
+                <w:sz w:val="20"/>
+                <w:szCs w:val="20"/>
+              </w:rPr>
+              <w:t xml:space="preserve">Coresight Research</w:t>
+            </w:r>
+          </w:p>
+        </w:tc>
+      </w:tr>
+      <w:tr>
+        <w:trPr>
+          <w:cantSplit/>
+        </w:trPr>
+        <w:tc>
+          <w:tcPr>
+            <w:tcW w:type="dxa" w:w="2200"/>
+            <w:tcBorders>
+              <w:top w:val="single" w:color="BFBFBF" w:sz="4"/>
+              <w:left w:val="single" w:color="BFBFBF" w:sz="4"/>
+              <w:bottom w:val="single" w:color="BFBFBF" w:sz="4"/>
+              <w:right w:val="single" w:color="BFBFBF" w:sz="4"/>
+            </w:tcBorders>
+            <w:tcMar>
+              <w:top w:type="dxa" w:w="80"/>
+              <w:left w:type="dxa" w:w="120"/>
+              <w:bottom w:type="dxa" w:w="80"/>
+              <w:right w:type="dxa" w:w="120"/>
+            </w:tcMar>
+          </w:tcPr>
+          <w:p>
+            <w:r>
+              <w:rPr>
+                <w:b w:val="false"/>
+                <w:bCs w:val="false"/>
+                <w:sz w:val="20"/>
+                <w:szCs w:val="20"/>
+              </w:rPr>
+              <w:t xml:space="preserve">Kelly Lindenau</w:t>
+            </w:r>
+          </w:p>
+        </w:tc>
+        <w:tc>
+          <w:tcPr>
+            <w:tcW w:type="dxa" w:w="1400"/>
+            <w:tcBorders>
+              <w:top w:val="single" w:color="BFBFBF" w:sz="4"/>
+              <w:left w:val="single" w:color="BFBFBF" w:sz="4"/>
+              <w:bottom w:val="single" w:color="BFBFBF" w:sz="4"/>
+              <w:right w:val="single" w:color="BFBFBF" w:sz="4"/>
+            </w:tcBorders>
+            <w:tcMar>
+              <w:top w:type="dxa" w:w="80"/>
+              <w:left w:type="dxa" w:w="120"/>
+              <w:bottom w:type="dxa" w:w="80"/>
+              <w:right w:type="dxa" w:w="120"/>
+            </w:tcMar>
+          </w:tcPr>
+          <w:p>
+            <w:r>
+              <w:rPr>
+                <w:b w:val="false"/>
+                <w:bCs w:val="false"/>
+                <w:sz w:val="20"/>
+                <w:szCs w:val="20"/>
+              </w:rPr>
+              <w:t xml:space="preserve">Panelist</w:t>
+            </w:r>
+          </w:p>
+        </w:tc>
+        <w:tc>
+          <w:tcPr>
+            <w:tcW w:type="dxa" w:w="3160"/>
+            <w:tcBorders>
+              <w:top w:val="single" w:color="BFBFBF" w:sz="4"/>
+              <w:left w:val="single" w:color="BFBFBF" w:sz="4"/>
+              <w:bottom w:val="single" w:color="BFBFBF" w:sz="4"/>
+              <w:right w:val="single" w:color="BFBFBF" w:sz="4"/>
+            </w:tcBorders>
+            <w:tcMar>
+              <w:top w:type="dxa" w:w="80"/>
+              <w:left w:type="dxa" w:w="120"/>
+              <w:bottom w:type="dxa" w:w="80"/>
+              <w:right w:type="dxa" w:w="120"/>
+            </w:tcMar>
+          </w:tcPr>
+          <w:p>
+            <w:r>
+              <w:rPr>
+                <w:b w:val="false"/>
+                <w:bCs w:val="false"/>
+                <w:sz w:val="20"/>
+                <w:szCs w:val="20"/>
+              </w:rPr>
+              <w:t xml:space="preserve">Content Director</w:t>
+            </w:r>
+          </w:p>
+        </w:tc>
+        <w:tc>
+          <w:tcPr>
+            <w:tcW w:type="dxa" w:w="2600"/>
+            <w:tcBorders>
+              <w:top w:val="single" w:color="BFBFBF" w:sz="4"/>
+              <w:left w:val="single" w:color="BFBFBF" w:sz="4"/>
+              <w:bottom w:val="single" w:color="BFBFBF" w:sz="4"/>
+              <w:right w:val="single" w:color="BFBFBF" w:sz="4"/>
+            </w:tcBorders>
+            <w:tcMar>
+              <w:top w:type="dxa" w:w="80"/>
+              <w:left w:type="dxa" w:w="120"/>
+              <w:bottom w:type="dxa" w:w="80"/>
+              <w:right w:type="dxa" w:w="120"/>
+            </w:tcMar>
+          </w:tcPr>
+          <w:p>
+            <w:r>
+              <w:rPr>
+                <w:b w:val="false"/>
+                <w:bCs w:val="false"/>
+                <w:sz w:val="20"/>
+                <w:szCs w:val="20"/>
+              </w:rPr>
+              <w:t xml:space="preserve">Groceryshop</w:t>
+            </w:r>
+          </w:p>
+        </w:tc>
+      </w:tr>
+      <w:tr>
+        <w:trPr>
+          <w:cantSplit/>
+        </w:trPr>
+        <w:tc>
+          <w:tcPr>
+            <w:tcW w:type="dxa" w:w="2200"/>
+            <w:tcBorders>
+              <w:top w:val="single" w:color="BFBFBF" w:sz="4"/>
+              <w:left w:val="single" w:color="BFBFBF" w:sz="4"/>
+              <w:bottom w:val="single" w:color="BFBFBF" w:sz="4"/>
+              <w:right w:val="single" w:color="BFBFBF" w:sz="4"/>
+            </w:tcBorders>
+            <w:shd w:fill="F2F2F2" w:color="auto" w:val="clear"/>
+            <w:tcMar>
+              <w:top w:type="dxa" w:w="80"/>
+              <w:left w:type="dxa" w:w="120"/>
+              <w:bottom w:type="dxa" w:w="80"/>
+              <w:right w:type="dxa" w:w="120"/>
+            </w:tcMar>
+          </w:tcPr>
+          <w:p>
+            <w:r>
+              <w:rPr>
+                <w:b w:val="false"/>
+                <w:bCs w:val="false"/>
+                <w:sz w:val="20"/>
+                <w:szCs w:val="20"/>
+              </w:rPr>
               <w:t xml:space="preserve">Chris Walton</w:t>
             </w:r>
           </w:p>
@@ -5129,7 +6367,7 @@
                 <w:sz w:val="20"/>
                 <w:szCs w:val="20"/>
               </w:rPr>
-              <w:t xml:space="preserve">President &amp; CEO (as introduced)</w:t>
+              <w:t xml:space="preserve">President &amp; CEO</w:t>
             </w:r>
           </w:p>
         </w:tc>
@@ -5158,7 +6396,7 @@
                 <w:sz w:val="20"/>
                 <w:szCs w:val="20"/>
               </w:rPr>
-              <w:t xml:space="preserve">Omni Talk Retail</w:t>
+              <w:t xml:space="preserve">Omni Talk</w:t>
             </w:r>
           </w:p>
         </w:tc>
@@ -5532,7 +6770,7 @@
                 <w:sz w:val="20"/>
                 <w:szCs w:val="20"/>
               </w:rPr>
-              <w:t xml:space="preserve">Kelli (Content Director, Groceryshop)</w:t>
+              <w:t xml:space="preserve">Kelly Lindenau (Content Director, Groceryshop)</w:t>
             </w:r>
           </w:p>
         </w:tc>
@@ -6638,7 +7876,7 @@
           <w:sz w:val="20"/>
           <w:szCs w:val="20"/>
         </w:rPr>
-        <w:t xml:space="preserve">KELLI</w:t>
+        <w:t xml:space="preserve">KELLY LINDENAU</w:t>
       </w:r>
     </w:p>
     <w:p>
@@ -6877,7 +8115,7 @@
           <w:sz w:val="20"/>
           <w:szCs w:val="20"/>
         </w:rPr>
-        <w:t xml:space="preserve">KELLI</w:t>
+        <w:t xml:space="preserve">KELLY LINDENAU</w:t>
       </w:r>
     </w:p>
     <w:p>
@@ -7553,7 +8791,7 @@
           <w:sz w:val="20"/>
           <w:szCs w:val="20"/>
         </w:rPr>
-        <w:t xml:space="preserve">KELLI</w:t>
+        <w:t xml:space="preserve">KELLY LINDENAU</w:t>
       </w:r>
     </w:p>
     <w:p>
@@ -7792,7 +9030,7 @@
           <w:sz w:val="20"/>
           <w:szCs w:val="20"/>
         </w:rPr>
-        <w:t xml:space="preserve">KELLI</w:t>
+        <w:t xml:space="preserve">KELLY LINDENAU</w:t>
       </w:r>
     </w:p>
     <w:p>
@@ -8097,7 +9335,7 @@
           <w:sz w:val="20"/>
           <w:szCs w:val="20"/>
         </w:rPr>
-        <w:t xml:space="preserve">KELLI</w:t>
+        <w:t xml:space="preserve">KELLY LINDENAU</w:t>
       </w:r>
     </w:p>
     <w:p>
@@ -8336,7 +9574,7 @@
           <w:sz w:val="20"/>
           <w:szCs w:val="20"/>
         </w:rPr>
-        <w:t xml:space="preserve">KELLI</w:t>
+        <w:t xml:space="preserve">KELLY LINDENAU</w:t>
       </w:r>
     </w:p>
     <w:p>
@@ -8460,6 +9698,950 @@
           <w:szCs w:val="21"/>
         </w:rPr>
         <w:t xml:space="preserve">I'm going to wrap with a quote and check me. I'm not going to tell you who's from because he was given offstage. He's from a retailer and they've been to see the Doordash. Keynote, all right. And they said, I'm worried. worried their thinking isn't right about their agent. Like, okay, well, let's, you know, it's working through. Because they, well, they call it as DoorDash. Like, okay, what's the problem? And if you're still thinking that agency is something you have to ask, you're still thinking about a search agent and that's the old-fashioned word. He said, we've been there retail a day and working on their agents to be proactive and to take action. And I think that was a bit of a check. If you're still thinking about AI as something that you need to ask and interact with as a search engine rather than as something you expect yourself doing for you, then that boat's already sailed. I thought that was really interesting. On that note, that was silent. Okay. In which case, all I'm going to say is the shop, shop, shop, shop, will be back, but still grocery.</w:t>
+      </w:r>
+    </w:p>
+    <w:p>
+      <w:pPr>
+        <w:pageBreakBefore/>
+        <w:spacing w:after="60"/>
+      </w:pPr>
+      <w:r>
+        <w:rPr>
+          <w:b/>
+          <w:bCs/>
+          <w:color w:val="7F7F7F"/>
+          <w:spacing w:val="40"/>
+          <w:sz w:val="18"/>
+          <w:szCs w:val="18"/>
+        </w:rPr>
+        <w:t xml:space="preserve">SESSION 7</w:t>
+      </w:r>
+    </w:p>
+    <w:p>
+      <w:pPr>
+        <w:pStyle w:val="Heading1"/>
+      </w:pPr>
+      <w:r>
+        <w:t xml:space="preserve">Title TBC: Women in the C-suite session</w:t>
+      </w:r>
+    </w:p>
+    <w:tbl>
+      <w:tblPr>
+        <w:tblW w:type="dxa" w:w="9360"/>
+        <w:tblBorders>
+          <w:top w:val="single" w:color="auto" w:sz="4"/>
+          <w:left w:val="single" w:color="auto" w:sz="4"/>
+          <w:bottom w:val="single" w:color="auto" w:sz="4"/>
+          <w:right w:val="single" w:color="auto" w:sz="4"/>
+          <w:insideH w:val="single" w:color="auto" w:sz="4"/>
+          <w:insideV w:val="single" w:color="auto" w:sz="4"/>
+        </w:tblBorders>
+      </w:tblPr>
+      <w:tblGrid>
+        <w:gridCol w:w="2200"/>
+        <w:gridCol w:w="7160"/>
+      </w:tblGrid>
+      <w:tr>
+        <w:trPr>
+          <w:tblHeader/>
+        </w:trPr>
+        <w:tc>
+          <w:tcPr>
+            <w:tcW w:type="dxa" w:w="2200"/>
+            <w:tcBorders>
+              <w:top w:val="single" w:color="BFBFBF" w:sz="4"/>
+              <w:left w:val="single" w:color="BFBFBF" w:sz="4"/>
+              <w:bottom w:val="single" w:color="BFBFBF" w:sz="4"/>
+              <w:right w:val="single" w:color="BFBFBF" w:sz="4"/>
+            </w:tcBorders>
+            <w:shd w:fill="1F4E79" w:color="auto" w:val="clear"/>
+            <w:tcMar>
+              <w:top w:type="dxa" w:w="80"/>
+              <w:left w:type="dxa" w:w="120"/>
+              <w:bottom w:type="dxa" w:w="80"/>
+              <w:right w:type="dxa" w:w="120"/>
+            </w:tcMar>
+          </w:tcPr>
+          <w:p>
+            <w:r>
+              <w:rPr>
+                <w:b/>
+                <w:bCs/>
+                <w:color w:val="FFFFFF"/>
+                <w:sz w:val="20"/>
+                <w:szCs w:val="20"/>
+              </w:rPr>
+              <w:t xml:space="preserve">Session Details</w:t>
+            </w:r>
+          </w:p>
+        </w:tc>
+        <w:tc>
+          <w:tcPr>
+            <w:tcW w:type="dxa" w:w="7160"/>
+            <w:tcBorders>
+              <w:top w:val="single" w:color="BFBFBF" w:sz="4"/>
+              <w:left w:val="single" w:color="BFBFBF" w:sz="4"/>
+              <w:bottom w:val="single" w:color="BFBFBF" w:sz="4"/>
+              <w:right w:val="single" w:color="BFBFBF" w:sz="4"/>
+            </w:tcBorders>
+            <w:shd w:fill="1F4E79" w:color="auto" w:val="clear"/>
+            <w:tcMar>
+              <w:top w:type="dxa" w:w="80"/>
+              <w:left w:type="dxa" w:w="120"/>
+              <w:bottom w:type="dxa" w:w="80"/>
+              <w:right w:type="dxa" w:w="120"/>
+            </w:tcMar>
+          </w:tcPr>
+          <w:p>
+            <w:r>
+              <w:rPr>
+                <w:b/>
+                <w:bCs/>
+                <w:color w:val="FFFFFF"/>
+                <w:sz w:val="20"/>
+                <w:szCs w:val="20"/>
+              </w:rPr>
+              <w:t xml:space="preserve"/>
+            </w:r>
+          </w:p>
+        </w:tc>
+      </w:tr>
+      <w:tr>
+        <w:trPr>
+          <w:cantSplit/>
+        </w:trPr>
+        <w:tc>
+          <w:tcPr>
+            <w:tcW w:type="dxa" w:w="2200"/>
+            <w:tcBorders>
+              <w:top w:val="single" w:color="BFBFBF" w:sz="4"/>
+              <w:left w:val="single" w:color="BFBFBF" w:sz="4"/>
+              <w:bottom w:val="single" w:color="BFBFBF" w:sz="4"/>
+              <w:right w:val="single" w:color="BFBFBF" w:sz="4"/>
+            </w:tcBorders>
+            <w:tcMar>
+              <w:top w:type="dxa" w:w="80"/>
+              <w:left w:type="dxa" w:w="120"/>
+              <w:bottom w:type="dxa" w:w="80"/>
+              <w:right w:type="dxa" w:w="120"/>
+            </w:tcMar>
+          </w:tcPr>
+          <w:p>
+            <w:r>
+              <w:rPr>
+                <w:b/>
+                <w:bCs/>
+                <w:sz w:val="20"/>
+                <w:szCs w:val="20"/>
+              </w:rPr>
+              <w:t xml:space="preserve">Date</w:t>
+            </w:r>
+          </w:p>
+        </w:tc>
+        <w:tc>
+          <w:tcPr>
+            <w:tcW w:type="dxa" w:w="7160"/>
+            <w:tcBorders>
+              <w:top w:val="single" w:color="BFBFBF" w:sz="4"/>
+              <w:left w:val="single" w:color="BFBFBF" w:sz="4"/>
+              <w:bottom w:val="single" w:color="BFBFBF" w:sz="4"/>
+              <w:right w:val="single" w:color="BFBFBF" w:sz="4"/>
+            </w:tcBorders>
+            <w:tcMar>
+              <w:top w:type="dxa" w:w="80"/>
+              <w:left w:type="dxa" w:w="120"/>
+              <w:bottom w:type="dxa" w:w="80"/>
+              <w:right w:type="dxa" w:w="120"/>
+            </w:tcMar>
+          </w:tcPr>
+          <w:p>
+            <w:r>
+              <w:rPr>
+                <w:b w:val="false"/>
+                <w:bCs w:val="false"/>
+                <w:sz w:val="20"/>
+                <w:szCs w:val="20"/>
+              </w:rPr>
+              <w:t xml:space="preserve">TBC</w:t>
+            </w:r>
+          </w:p>
+        </w:tc>
+      </w:tr>
+      <w:tr>
+        <w:trPr>
+          <w:cantSplit/>
+        </w:trPr>
+        <w:tc>
+          <w:tcPr>
+            <w:tcW w:type="dxa" w:w="2200"/>
+            <w:tcBorders>
+              <w:top w:val="single" w:color="BFBFBF" w:sz="4"/>
+              <w:left w:val="single" w:color="BFBFBF" w:sz="4"/>
+              <w:bottom w:val="single" w:color="BFBFBF" w:sz="4"/>
+              <w:right w:val="single" w:color="BFBFBF" w:sz="4"/>
+            </w:tcBorders>
+            <w:shd w:fill="F2F2F2" w:color="auto" w:val="clear"/>
+            <w:tcMar>
+              <w:top w:type="dxa" w:w="80"/>
+              <w:left w:type="dxa" w:w="120"/>
+              <w:bottom w:type="dxa" w:w="80"/>
+              <w:right w:type="dxa" w:w="120"/>
+            </w:tcMar>
+          </w:tcPr>
+          <w:p>
+            <w:r>
+              <w:rPr>
+                <w:b/>
+                <w:bCs/>
+                <w:sz w:val="20"/>
+                <w:szCs w:val="20"/>
+              </w:rPr>
+              <w:t xml:space="preserve">Time</w:t>
+            </w:r>
+          </w:p>
+        </w:tc>
+        <w:tc>
+          <w:tcPr>
+            <w:tcW w:type="dxa" w:w="7160"/>
+            <w:tcBorders>
+              <w:top w:val="single" w:color="BFBFBF" w:sz="4"/>
+              <w:left w:val="single" w:color="BFBFBF" w:sz="4"/>
+              <w:bottom w:val="single" w:color="BFBFBF" w:sz="4"/>
+              <w:right w:val="single" w:color="BFBFBF" w:sz="4"/>
+            </w:tcBorders>
+            <w:shd w:fill="F2F2F2" w:color="auto" w:val="clear"/>
+            <w:tcMar>
+              <w:top w:type="dxa" w:w="80"/>
+              <w:left w:type="dxa" w:w="120"/>
+              <w:bottom w:type="dxa" w:w="80"/>
+              <w:right w:type="dxa" w:w="120"/>
+            </w:tcMar>
+          </w:tcPr>
+          <w:p>
+            <w:r>
+              <w:rPr>
+                <w:b w:val="false"/>
+                <w:bCs w:val="false"/>
+                <w:sz w:val="20"/>
+                <w:szCs w:val="20"/>
+              </w:rPr>
+              <w:t xml:space="preserve">TBC</w:t>
+            </w:r>
+          </w:p>
+        </w:tc>
+      </w:tr>
+      <w:tr>
+        <w:trPr>
+          <w:cantSplit/>
+        </w:trPr>
+        <w:tc>
+          <w:tcPr>
+            <w:tcW w:type="dxa" w:w="2200"/>
+            <w:tcBorders>
+              <w:top w:val="single" w:color="BFBFBF" w:sz="4"/>
+              <w:left w:val="single" w:color="BFBFBF" w:sz="4"/>
+              <w:bottom w:val="single" w:color="BFBFBF" w:sz="4"/>
+              <w:right w:val="single" w:color="BFBFBF" w:sz="4"/>
+            </w:tcBorders>
+            <w:tcMar>
+              <w:top w:type="dxa" w:w="80"/>
+              <w:left w:type="dxa" w:w="120"/>
+              <w:bottom w:type="dxa" w:w="80"/>
+              <w:right w:type="dxa" w:w="120"/>
+            </w:tcMar>
+          </w:tcPr>
+          <w:p>
+            <w:r>
+              <w:rPr>
+                <w:b/>
+                <w:bCs/>
+                <w:sz w:val="20"/>
+                <w:szCs w:val="20"/>
+              </w:rPr>
+              <w:t xml:space="preserve">Stage</w:t>
+            </w:r>
+          </w:p>
+        </w:tc>
+        <w:tc>
+          <w:tcPr>
+            <w:tcW w:type="dxa" w:w="7160"/>
+            <w:tcBorders>
+              <w:top w:val="single" w:color="BFBFBF" w:sz="4"/>
+              <w:left w:val="single" w:color="BFBFBF" w:sz="4"/>
+              <w:bottom w:val="single" w:color="BFBFBF" w:sz="4"/>
+              <w:right w:val="single" w:color="BFBFBF" w:sz="4"/>
+            </w:tcBorders>
+            <w:tcMar>
+              <w:top w:type="dxa" w:w="80"/>
+              <w:left w:type="dxa" w:w="120"/>
+              <w:bottom w:type="dxa" w:w="80"/>
+              <w:right w:type="dxa" w:w="120"/>
+            </w:tcMar>
+          </w:tcPr>
+          <w:p>
+            <w:r>
+              <w:rPr>
+                <w:b w:val="false"/>
+                <w:bCs w:val="false"/>
+                <w:sz w:val="20"/>
+                <w:szCs w:val="20"/>
+              </w:rPr>
+              <w:t xml:space="preserve">TBC</w:t>
+            </w:r>
+          </w:p>
+        </w:tc>
+      </w:tr>
+      <w:tr>
+        <w:trPr>
+          <w:cantSplit/>
+        </w:trPr>
+        <w:tc>
+          <w:tcPr>
+            <w:tcW w:type="dxa" w:w="2200"/>
+            <w:tcBorders>
+              <w:top w:val="single" w:color="BFBFBF" w:sz="4"/>
+              <w:left w:val="single" w:color="BFBFBF" w:sz="4"/>
+              <w:bottom w:val="single" w:color="BFBFBF" w:sz="4"/>
+              <w:right w:val="single" w:color="BFBFBF" w:sz="4"/>
+            </w:tcBorders>
+            <w:shd w:fill="F2F2F2" w:color="auto" w:val="clear"/>
+            <w:tcMar>
+              <w:top w:type="dxa" w:w="80"/>
+              <w:left w:type="dxa" w:w="120"/>
+              <w:bottom w:type="dxa" w:w="80"/>
+              <w:right w:type="dxa" w:w="120"/>
+            </w:tcMar>
+          </w:tcPr>
+          <w:p>
+            <w:r>
+              <w:rPr>
+                <w:b/>
+                <w:bCs/>
+                <w:sz w:val="20"/>
+                <w:szCs w:val="20"/>
+              </w:rPr>
+              <w:t xml:space="preserve">Notes</w:t>
+            </w:r>
+          </w:p>
+        </w:tc>
+        <w:tc>
+          <w:tcPr>
+            <w:tcW w:type="dxa" w:w="7160"/>
+            <w:tcBorders>
+              <w:top w:val="single" w:color="BFBFBF" w:sz="4"/>
+              <w:left w:val="single" w:color="BFBFBF" w:sz="4"/>
+              <w:bottom w:val="single" w:color="BFBFBF" w:sz="4"/>
+              <w:right w:val="single" w:color="BFBFBF" w:sz="4"/>
+            </w:tcBorders>
+            <w:shd w:fill="F2F2F2" w:color="auto" w:val="clear"/>
+            <w:tcMar>
+              <w:top w:type="dxa" w:w="80"/>
+              <w:left w:type="dxa" w:w="120"/>
+              <w:bottom w:type="dxa" w:w="80"/>
+              <w:right w:type="dxa" w:w="120"/>
+            </w:tcMar>
+          </w:tcPr>
+          <w:p>
+            <w:r>
+              <w:rPr>
+                <w:b w:val="false"/>
+                <w:bCs w:val="false"/>
+                <w:sz w:val="20"/>
+                <w:szCs w:val="20"/>
+              </w:rPr>
+              <w:t xml:space="preserve">Transcript to follow</w:t>
+            </w:r>
+          </w:p>
+        </w:tc>
+      </w:tr>
+      <w:tr>
+        <w:trPr>
+          <w:cantSplit/>
+        </w:trPr>
+        <w:tc>
+          <w:tcPr>
+            <w:tcW w:type="dxa" w:w="2200"/>
+            <w:tcBorders>
+              <w:top w:val="single" w:color="BFBFBF" w:sz="4"/>
+              <w:left w:val="single" w:color="BFBFBF" w:sz="4"/>
+              <w:bottom w:val="single" w:color="BFBFBF" w:sz="4"/>
+              <w:right w:val="single" w:color="BFBFBF" w:sz="4"/>
+            </w:tcBorders>
+            <w:tcMar>
+              <w:top w:type="dxa" w:w="80"/>
+              <w:left w:type="dxa" w:w="120"/>
+              <w:bottom w:type="dxa" w:w="80"/>
+              <w:right w:type="dxa" w:w="120"/>
+            </w:tcMar>
+          </w:tcPr>
+          <w:p>
+            <w:r>
+              <w:rPr>
+                <w:b/>
+                <w:bCs/>
+                <w:sz w:val="20"/>
+                <w:szCs w:val="20"/>
+              </w:rPr>
+              <w:t xml:space="preserve">Title</w:t>
+            </w:r>
+          </w:p>
+        </w:tc>
+        <w:tc>
+          <w:tcPr>
+            <w:tcW w:type="dxa" w:w="7160"/>
+            <w:tcBorders>
+              <w:top w:val="single" w:color="BFBFBF" w:sz="4"/>
+              <w:left w:val="single" w:color="BFBFBF" w:sz="4"/>
+              <w:bottom w:val="single" w:color="BFBFBF" w:sz="4"/>
+              <w:right w:val="single" w:color="BFBFBF" w:sz="4"/>
+            </w:tcBorders>
+            <w:tcMar>
+              <w:top w:type="dxa" w:w="80"/>
+              <w:left w:type="dxa" w:w="120"/>
+              <w:bottom w:type="dxa" w:w="80"/>
+              <w:right w:type="dxa" w:w="120"/>
+            </w:tcMar>
+          </w:tcPr>
+          <w:p>
+            <w:r>
+              <w:rPr>
+                <w:b w:val="false"/>
+                <w:bCs w:val="false"/>
+                <w:sz w:val="20"/>
+                <w:szCs w:val="20"/>
+              </w:rPr>
+              <w:t xml:space="preserve">Title, date, time and stage not shown in the screenshot; the About text begins “Women continue to break barriers in the C-suite by leading with resilience, influence, and a willingness to challenge the status quo.”</w:t>
+            </w:r>
+          </w:p>
+        </w:tc>
+      </w:tr>
+    </w:tbl>
+    <w:p>
+      <w:pPr>
+        <w:pStyle w:val="Heading2"/>
+      </w:pPr>
+      <w:r>
+        <w:t xml:space="preserve">Speakers</w:t>
+      </w:r>
+    </w:p>
+    <w:tbl>
+      <w:tblPr>
+        <w:tblW w:type="dxa" w:w="9360"/>
+        <w:tblBorders>
+          <w:top w:val="single" w:color="auto" w:sz="4"/>
+          <w:left w:val="single" w:color="auto" w:sz="4"/>
+          <w:bottom w:val="single" w:color="auto" w:sz="4"/>
+          <w:right w:val="single" w:color="auto" w:sz="4"/>
+          <w:insideH w:val="single" w:color="auto" w:sz="4"/>
+          <w:insideV w:val="single" w:color="auto" w:sz="4"/>
+        </w:tblBorders>
+      </w:tblPr>
+      <w:tblGrid>
+        <w:gridCol w:w="2200"/>
+        <w:gridCol w:w="1400"/>
+        <w:gridCol w:w="3160"/>
+        <w:gridCol w:w="2600"/>
+      </w:tblGrid>
+      <w:tr>
+        <w:trPr>
+          <w:tblHeader/>
+        </w:trPr>
+        <w:tc>
+          <w:tcPr>
+            <w:tcW w:type="dxa" w:w="2200"/>
+            <w:tcBorders>
+              <w:top w:val="single" w:color="BFBFBF" w:sz="4"/>
+              <w:left w:val="single" w:color="BFBFBF" w:sz="4"/>
+              <w:bottom w:val="single" w:color="BFBFBF" w:sz="4"/>
+              <w:right w:val="single" w:color="BFBFBF" w:sz="4"/>
+            </w:tcBorders>
+            <w:shd w:fill="1F4E79" w:color="auto" w:val="clear"/>
+            <w:tcMar>
+              <w:top w:type="dxa" w:w="80"/>
+              <w:left w:type="dxa" w:w="120"/>
+              <w:bottom w:type="dxa" w:w="80"/>
+              <w:right w:type="dxa" w:w="120"/>
+            </w:tcMar>
+          </w:tcPr>
+          <w:p>
+            <w:r>
+              <w:rPr>
+                <w:b/>
+                <w:bCs/>
+                <w:color w:val="FFFFFF"/>
+                <w:sz w:val="20"/>
+                <w:szCs w:val="20"/>
+              </w:rPr>
+              <w:t xml:space="preserve">Name</w:t>
+            </w:r>
+          </w:p>
+        </w:tc>
+        <w:tc>
+          <w:tcPr>
+            <w:tcW w:type="dxa" w:w="1400"/>
+            <w:tcBorders>
+              <w:top w:val="single" w:color="BFBFBF" w:sz="4"/>
+              <w:left w:val="single" w:color="BFBFBF" w:sz="4"/>
+              <w:bottom w:val="single" w:color="BFBFBF" w:sz="4"/>
+              <w:right w:val="single" w:color="BFBFBF" w:sz="4"/>
+            </w:tcBorders>
+            <w:shd w:fill="1F4E79" w:color="auto" w:val="clear"/>
+            <w:tcMar>
+              <w:top w:type="dxa" w:w="80"/>
+              <w:left w:type="dxa" w:w="120"/>
+              <w:bottom w:type="dxa" w:w="80"/>
+              <w:right w:type="dxa" w:w="120"/>
+            </w:tcMar>
+          </w:tcPr>
+          <w:p>
+            <w:r>
+              <w:rPr>
+                <w:b/>
+                <w:bCs/>
+                <w:color w:val="FFFFFF"/>
+                <w:sz w:val="20"/>
+                <w:szCs w:val="20"/>
+              </w:rPr>
+              <w:t xml:space="preserve">Role</w:t>
+            </w:r>
+          </w:p>
+        </w:tc>
+        <w:tc>
+          <w:tcPr>
+            <w:tcW w:type="dxa" w:w="3160"/>
+            <w:tcBorders>
+              <w:top w:val="single" w:color="BFBFBF" w:sz="4"/>
+              <w:left w:val="single" w:color="BFBFBF" w:sz="4"/>
+              <w:bottom w:val="single" w:color="BFBFBF" w:sz="4"/>
+              <w:right w:val="single" w:color="BFBFBF" w:sz="4"/>
+            </w:tcBorders>
+            <w:shd w:fill="1F4E79" w:color="auto" w:val="clear"/>
+            <w:tcMar>
+              <w:top w:type="dxa" w:w="80"/>
+              <w:left w:type="dxa" w:w="120"/>
+              <w:bottom w:type="dxa" w:w="80"/>
+              <w:right w:type="dxa" w:w="120"/>
+            </w:tcMar>
+          </w:tcPr>
+          <w:p>
+            <w:r>
+              <w:rPr>
+                <w:b/>
+                <w:bCs/>
+                <w:color w:val="FFFFFF"/>
+                <w:sz w:val="20"/>
+                <w:szCs w:val="20"/>
+              </w:rPr>
+              <w:t xml:space="preserve">Title</w:t>
+            </w:r>
+          </w:p>
+        </w:tc>
+        <w:tc>
+          <w:tcPr>
+            <w:tcW w:type="dxa" w:w="2600"/>
+            <w:tcBorders>
+              <w:top w:val="single" w:color="BFBFBF" w:sz="4"/>
+              <w:left w:val="single" w:color="BFBFBF" w:sz="4"/>
+              <w:bottom w:val="single" w:color="BFBFBF" w:sz="4"/>
+              <w:right w:val="single" w:color="BFBFBF" w:sz="4"/>
+            </w:tcBorders>
+            <w:shd w:fill="1F4E79" w:color="auto" w:val="clear"/>
+            <w:tcMar>
+              <w:top w:type="dxa" w:w="80"/>
+              <w:left w:type="dxa" w:w="120"/>
+              <w:bottom w:type="dxa" w:w="80"/>
+              <w:right w:type="dxa" w:w="120"/>
+            </w:tcMar>
+          </w:tcPr>
+          <w:p>
+            <w:r>
+              <w:rPr>
+                <w:b/>
+                <w:bCs/>
+                <w:color w:val="FFFFFF"/>
+                <w:sz w:val="20"/>
+                <w:szCs w:val="20"/>
+              </w:rPr>
+              <w:t xml:space="preserve">Organisation</w:t>
+            </w:r>
+          </w:p>
+        </w:tc>
+      </w:tr>
+      <w:tr>
+        <w:trPr>
+          <w:cantSplit/>
+        </w:trPr>
+        <w:tc>
+          <w:tcPr>
+            <w:tcW w:type="dxa" w:w="2200"/>
+            <w:tcBorders>
+              <w:top w:val="single" w:color="BFBFBF" w:sz="4"/>
+              <w:left w:val="single" w:color="BFBFBF" w:sz="4"/>
+              <w:bottom w:val="single" w:color="BFBFBF" w:sz="4"/>
+              <w:right w:val="single" w:color="BFBFBF" w:sz="4"/>
+            </w:tcBorders>
+            <w:tcMar>
+              <w:top w:type="dxa" w:w="80"/>
+              <w:left w:type="dxa" w:w="120"/>
+              <w:bottom w:type="dxa" w:w="80"/>
+              <w:right w:type="dxa" w:w="120"/>
+            </w:tcMar>
+          </w:tcPr>
+          <w:p>
+            <w:r>
+              <w:rPr>
+                <w:b w:val="false"/>
+                <w:bCs w:val="false"/>
+                <w:sz w:val="20"/>
+                <w:szCs w:val="20"/>
+              </w:rPr>
+              <w:t xml:space="preserve">Kait Stephens</w:t>
+            </w:r>
+          </w:p>
+        </w:tc>
+        <w:tc>
+          <w:tcPr>
+            <w:tcW w:type="dxa" w:w="1400"/>
+            <w:tcBorders>
+              <w:top w:val="single" w:color="BFBFBF" w:sz="4"/>
+              <w:left w:val="single" w:color="BFBFBF" w:sz="4"/>
+              <w:bottom w:val="single" w:color="BFBFBF" w:sz="4"/>
+              <w:right w:val="single" w:color="BFBFBF" w:sz="4"/>
+            </w:tcBorders>
+            <w:tcMar>
+              <w:top w:type="dxa" w:w="80"/>
+              <w:left w:type="dxa" w:w="120"/>
+              <w:bottom w:type="dxa" w:w="80"/>
+              <w:right w:type="dxa" w:w="120"/>
+            </w:tcMar>
+          </w:tcPr>
+          <w:p>
+            <w:r>
+              <w:rPr>
+                <w:b w:val="false"/>
+                <w:bCs w:val="false"/>
+                <w:sz w:val="20"/>
+                <w:szCs w:val="20"/>
+              </w:rPr>
+              <w:t xml:space="preserve">Moderator</w:t>
+            </w:r>
+          </w:p>
+        </w:tc>
+        <w:tc>
+          <w:tcPr>
+            <w:tcW w:type="dxa" w:w="3160"/>
+            <w:tcBorders>
+              <w:top w:val="single" w:color="BFBFBF" w:sz="4"/>
+              <w:left w:val="single" w:color="BFBFBF" w:sz="4"/>
+              <w:bottom w:val="single" w:color="BFBFBF" w:sz="4"/>
+              <w:right w:val="single" w:color="BFBFBF" w:sz="4"/>
+            </w:tcBorders>
+            <w:tcMar>
+              <w:top w:type="dxa" w:w="80"/>
+              <w:left w:type="dxa" w:w="120"/>
+              <w:bottom w:type="dxa" w:w="80"/>
+              <w:right w:type="dxa" w:w="120"/>
+            </w:tcMar>
+          </w:tcPr>
+          <w:p>
+            <w:r>
+              <w:rPr>
+                <w:b w:val="false"/>
+                <w:bCs w:val="false"/>
+                <w:sz w:val="20"/>
+                <w:szCs w:val="20"/>
+              </w:rPr>
+              <w:t xml:space="preserve">Podcast Host, Retail Industry Expert</w:t>
+            </w:r>
+          </w:p>
+        </w:tc>
+        <w:tc>
+          <w:tcPr>
+            <w:tcW w:type="dxa" w:w="2600"/>
+            <w:tcBorders>
+              <w:top w:val="single" w:color="BFBFBF" w:sz="4"/>
+              <w:left w:val="single" w:color="BFBFBF" w:sz="4"/>
+              <w:bottom w:val="single" w:color="BFBFBF" w:sz="4"/>
+              <w:right w:val="single" w:color="BFBFBF" w:sz="4"/>
+            </w:tcBorders>
+            <w:tcMar>
+              <w:top w:type="dxa" w:w="80"/>
+              <w:left w:type="dxa" w:w="120"/>
+              <w:bottom w:type="dxa" w:w="80"/>
+              <w:right w:type="dxa" w:w="120"/>
+            </w:tcMar>
+          </w:tcPr>
+          <w:p>
+            <w:r>
+              <w:rPr>
+                <w:b w:val="false"/>
+                <w:bCs w:val="false"/>
+                <w:sz w:val="20"/>
+                <w:szCs w:val="20"/>
+              </w:rPr>
+              <w:t xml:space="preserve">The Omnichannel Marketer</w:t>
+            </w:r>
+          </w:p>
+        </w:tc>
+      </w:tr>
+      <w:tr>
+        <w:trPr>
+          <w:cantSplit/>
+        </w:trPr>
+        <w:tc>
+          <w:tcPr>
+            <w:tcW w:type="dxa" w:w="2200"/>
+            <w:tcBorders>
+              <w:top w:val="single" w:color="BFBFBF" w:sz="4"/>
+              <w:left w:val="single" w:color="BFBFBF" w:sz="4"/>
+              <w:bottom w:val="single" w:color="BFBFBF" w:sz="4"/>
+              <w:right w:val="single" w:color="BFBFBF" w:sz="4"/>
+            </w:tcBorders>
+            <w:shd w:fill="F2F2F2" w:color="auto" w:val="clear"/>
+            <w:tcMar>
+              <w:top w:type="dxa" w:w="80"/>
+              <w:left w:type="dxa" w:w="120"/>
+              <w:bottom w:type="dxa" w:w="80"/>
+              <w:right w:type="dxa" w:w="120"/>
+            </w:tcMar>
+          </w:tcPr>
+          <w:p>
+            <w:r>
+              <w:rPr>
+                <w:b w:val="false"/>
+                <w:bCs w:val="false"/>
+                <w:sz w:val="20"/>
+                <w:szCs w:val="20"/>
+              </w:rPr>
+              <w:t xml:space="preserve">Leah Key</w:t>
+            </w:r>
+          </w:p>
+        </w:tc>
+        <w:tc>
+          <w:tcPr>
+            <w:tcW w:type="dxa" w:w="1400"/>
+            <w:tcBorders>
+              <w:top w:val="single" w:color="BFBFBF" w:sz="4"/>
+              <w:left w:val="single" w:color="BFBFBF" w:sz="4"/>
+              <w:bottom w:val="single" w:color="BFBFBF" w:sz="4"/>
+              <w:right w:val="single" w:color="BFBFBF" w:sz="4"/>
+            </w:tcBorders>
+            <w:shd w:fill="F2F2F2" w:color="auto" w:val="clear"/>
+            <w:tcMar>
+              <w:top w:type="dxa" w:w="80"/>
+              <w:left w:type="dxa" w:w="120"/>
+              <w:bottom w:type="dxa" w:w="80"/>
+              <w:right w:type="dxa" w:w="120"/>
+            </w:tcMar>
+          </w:tcPr>
+          <w:p>
+            <w:r>
+              <w:rPr>
+                <w:b w:val="false"/>
+                <w:bCs w:val="false"/>
+                <w:sz w:val="20"/>
+                <w:szCs w:val="20"/>
+              </w:rPr>
+              <w:t xml:space="preserve">Panelist</w:t>
+            </w:r>
+          </w:p>
+        </w:tc>
+        <w:tc>
+          <w:tcPr>
+            <w:tcW w:type="dxa" w:w="3160"/>
+            <w:tcBorders>
+              <w:top w:val="single" w:color="BFBFBF" w:sz="4"/>
+              <w:left w:val="single" w:color="BFBFBF" w:sz="4"/>
+              <w:bottom w:val="single" w:color="BFBFBF" w:sz="4"/>
+              <w:right w:val="single" w:color="BFBFBF" w:sz="4"/>
+            </w:tcBorders>
+            <w:shd w:fill="F2F2F2" w:color="auto" w:val="clear"/>
+            <w:tcMar>
+              <w:top w:type="dxa" w:w="80"/>
+              <w:left w:type="dxa" w:w="120"/>
+              <w:bottom w:type="dxa" w:w="80"/>
+              <w:right w:type="dxa" w:w="120"/>
+            </w:tcMar>
+          </w:tcPr>
+          <w:p>
+            <w:r>
+              <w:rPr>
+                <w:b w:val="false"/>
+                <w:bCs w:val="false"/>
+                <w:sz w:val="20"/>
+                <w:szCs w:val="20"/>
+              </w:rPr>
+              <w:t xml:space="preserve">President</w:t>
+            </w:r>
+          </w:p>
+        </w:tc>
+        <w:tc>
+          <w:tcPr>
+            <w:tcW w:type="dxa" w:w="2600"/>
+            <w:tcBorders>
+              <w:top w:val="single" w:color="BFBFBF" w:sz="4"/>
+              <w:left w:val="single" w:color="BFBFBF" w:sz="4"/>
+              <w:bottom w:val="single" w:color="BFBFBF" w:sz="4"/>
+              <w:right w:val="single" w:color="BFBFBF" w:sz="4"/>
+            </w:tcBorders>
+            <w:shd w:fill="F2F2F2" w:color="auto" w:val="clear"/>
+            <w:tcMar>
+              <w:top w:type="dxa" w:w="80"/>
+              <w:left w:type="dxa" w:w="120"/>
+              <w:bottom w:type="dxa" w:w="80"/>
+              <w:right w:type="dxa" w:w="120"/>
+            </w:tcMar>
+          </w:tcPr>
+          <w:p>
+            <w:r>
+              <w:rPr>
+                <w:b w:val="false"/>
+                <w:bCs w:val="false"/>
+                <w:sz w:val="20"/>
+                <w:szCs w:val="20"/>
+              </w:rPr>
+              <w:t xml:space="preserve">5-Hour Energy</w:t>
+            </w:r>
+          </w:p>
+        </w:tc>
+      </w:tr>
+      <w:tr>
+        <w:trPr>
+          <w:cantSplit/>
+        </w:trPr>
+        <w:tc>
+          <w:tcPr>
+            <w:tcW w:type="dxa" w:w="2200"/>
+            <w:tcBorders>
+              <w:top w:val="single" w:color="BFBFBF" w:sz="4"/>
+              <w:left w:val="single" w:color="BFBFBF" w:sz="4"/>
+              <w:bottom w:val="single" w:color="BFBFBF" w:sz="4"/>
+              <w:right w:val="single" w:color="BFBFBF" w:sz="4"/>
+            </w:tcBorders>
+            <w:tcMar>
+              <w:top w:type="dxa" w:w="80"/>
+              <w:left w:type="dxa" w:w="120"/>
+              <w:bottom w:type="dxa" w:w="80"/>
+              <w:right w:type="dxa" w:w="120"/>
+            </w:tcMar>
+          </w:tcPr>
+          <w:p>
+            <w:r>
+              <w:rPr>
+                <w:b w:val="false"/>
+                <w:bCs w:val="false"/>
+                <w:sz w:val="20"/>
+                <w:szCs w:val="20"/>
+              </w:rPr>
+              <w:t xml:space="preserve">Tandy Harvey</w:t>
+            </w:r>
+          </w:p>
+        </w:tc>
+        <w:tc>
+          <w:tcPr>
+            <w:tcW w:type="dxa" w:w="1400"/>
+            <w:tcBorders>
+              <w:top w:val="single" w:color="BFBFBF" w:sz="4"/>
+              <w:left w:val="single" w:color="BFBFBF" w:sz="4"/>
+              <w:bottom w:val="single" w:color="BFBFBF" w:sz="4"/>
+              <w:right w:val="single" w:color="BFBFBF" w:sz="4"/>
+            </w:tcBorders>
+            <w:tcMar>
+              <w:top w:type="dxa" w:w="80"/>
+              <w:left w:type="dxa" w:w="120"/>
+              <w:bottom w:type="dxa" w:w="80"/>
+              <w:right w:type="dxa" w:w="120"/>
+            </w:tcMar>
+          </w:tcPr>
+          <w:p>
+            <w:r>
+              <w:rPr>
+                <w:b w:val="false"/>
+                <w:bCs w:val="false"/>
+                <w:sz w:val="20"/>
+                <w:szCs w:val="20"/>
+              </w:rPr>
+              <w:t xml:space="preserve">Panelist</w:t>
+            </w:r>
+          </w:p>
+        </w:tc>
+        <w:tc>
+          <w:tcPr>
+            <w:tcW w:type="dxa" w:w="3160"/>
+            <w:tcBorders>
+              <w:top w:val="single" w:color="BFBFBF" w:sz="4"/>
+              <w:left w:val="single" w:color="BFBFBF" w:sz="4"/>
+              <w:bottom w:val="single" w:color="BFBFBF" w:sz="4"/>
+              <w:right w:val="single" w:color="BFBFBF" w:sz="4"/>
+            </w:tcBorders>
+            <w:tcMar>
+              <w:top w:type="dxa" w:w="80"/>
+              <w:left w:type="dxa" w:w="120"/>
+              <w:bottom w:type="dxa" w:w="80"/>
+              <w:right w:type="dxa" w:w="120"/>
+            </w:tcMar>
+          </w:tcPr>
+          <w:p>
+            <w:r>
+              <w:rPr>
+                <w:b w:val="false"/>
+                <w:bCs w:val="false"/>
+                <w:sz w:val="20"/>
+                <w:szCs w:val="20"/>
+              </w:rPr>
+              <w:t xml:space="preserve">CEO</w:t>
+            </w:r>
+          </w:p>
+        </w:tc>
+        <w:tc>
+          <w:tcPr>
+            <w:tcW w:type="dxa" w:w="2600"/>
+            <w:tcBorders>
+              <w:top w:val="single" w:color="BFBFBF" w:sz="4"/>
+              <w:left w:val="single" w:color="BFBFBF" w:sz="4"/>
+              <w:bottom w:val="single" w:color="BFBFBF" w:sz="4"/>
+              <w:right w:val="single" w:color="BFBFBF" w:sz="4"/>
+            </w:tcBorders>
+            <w:tcMar>
+              <w:top w:type="dxa" w:w="80"/>
+              <w:left w:type="dxa" w:w="120"/>
+              <w:bottom w:type="dxa" w:w="80"/>
+              <w:right w:type="dxa" w:w="120"/>
+            </w:tcMar>
+          </w:tcPr>
+          <w:p>
+            <w:r>
+              <w:rPr>
+                <w:b w:val="false"/>
+                <w:bCs w:val="false"/>
+                <w:sz w:val="20"/>
+                <w:szCs w:val="20"/>
+              </w:rPr>
+              <w:t xml:space="preserve">National Co+Op Grocers</w:t>
+            </w:r>
+          </w:p>
+        </w:tc>
+      </w:tr>
+    </w:tbl>
+    <w:p>
+      <w:pPr>
+        <w:pStyle w:val="Heading2"/>
+      </w:pPr>
+      <w:r>
+        <w:t xml:space="preserve">Transcript</w:t>
+      </w:r>
+    </w:p>
+    <w:p>
+      <w:pPr>
+        <w:spacing w:after="120"/>
+      </w:pPr>
+      <w:r>
+        <w:rPr>
+          <w:i/>
+          <w:iCs/>
+          <w:color w:val="7F7F7F"/>
+        </w:rPr>
+        <w:t xml:space="preserve">Transcript to follow.</w:t>
       </w:r>
     </w:p>
     <w:sectPr>

</xml_diff>

<commit_message>
Add Chris Walton as moderator of the Sam's Club session
Co-Authored-By: Claude Opus 5.5 <noreply@anthropic.com>
Claude-Session: https://claude.ai/code/session_01KmRp2ESunoKfn1WQuEFGHQ
</commit_message>
<xml_diff>
--- a/transcripts/Groceryshop_2026_Session_Notes.docx
+++ b/transcripts/Groceryshop_2026_Session_Notes.docx
@@ -10274,6 +10274,124 @@
                 <w:sz w:val="20"/>
                 <w:szCs w:val="20"/>
               </w:rPr>
+              <w:t xml:space="preserve">Chris Walton</w:t>
+            </w:r>
+          </w:p>
+        </w:tc>
+        <w:tc>
+          <w:tcPr>
+            <w:tcW w:type="dxa" w:w="1400"/>
+            <w:tcBorders>
+              <w:top w:val="single" w:color="BFBFBF" w:sz="4"/>
+              <w:left w:val="single" w:color="BFBFBF" w:sz="4"/>
+              <w:bottom w:val="single" w:color="BFBFBF" w:sz="4"/>
+              <w:right w:val="single" w:color="BFBFBF" w:sz="4"/>
+            </w:tcBorders>
+            <w:tcMar>
+              <w:top w:type="dxa" w:w="80"/>
+              <w:left w:type="dxa" w:w="120"/>
+              <w:bottom w:type="dxa" w:w="80"/>
+              <w:right w:type="dxa" w:w="120"/>
+            </w:tcMar>
+          </w:tcPr>
+          <w:p>
+            <w:r>
+              <w:rPr>
+                <w:b w:val="false"/>
+                <w:bCs w:val="false"/>
+                <w:sz w:val="20"/>
+                <w:szCs w:val="20"/>
+              </w:rPr>
+              <w:t xml:space="preserve">Moderator</w:t>
+            </w:r>
+          </w:p>
+        </w:tc>
+        <w:tc>
+          <w:tcPr>
+            <w:tcW w:type="dxa" w:w="3160"/>
+            <w:tcBorders>
+              <w:top w:val="single" w:color="BFBFBF" w:sz="4"/>
+              <w:left w:val="single" w:color="BFBFBF" w:sz="4"/>
+              <w:bottom w:val="single" w:color="BFBFBF" w:sz="4"/>
+              <w:right w:val="single" w:color="BFBFBF" w:sz="4"/>
+            </w:tcBorders>
+            <w:tcMar>
+              <w:top w:type="dxa" w:w="80"/>
+              <w:left w:type="dxa" w:w="120"/>
+              <w:bottom w:type="dxa" w:w="80"/>
+              <w:right w:type="dxa" w:w="120"/>
+            </w:tcMar>
+          </w:tcPr>
+          <w:p>
+            <w:r>
+              <w:rPr>
+                <w:b w:val="false"/>
+                <w:bCs w:val="false"/>
+                <w:sz w:val="20"/>
+                <w:szCs w:val="20"/>
+              </w:rPr>
+              <w:t xml:space="preserve">President &amp; CEO</w:t>
+            </w:r>
+          </w:p>
+        </w:tc>
+        <w:tc>
+          <w:tcPr>
+            <w:tcW w:type="dxa" w:w="2600"/>
+            <w:tcBorders>
+              <w:top w:val="single" w:color="BFBFBF" w:sz="4"/>
+              <w:left w:val="single" w:color="BFBFBF" w:sz="4"/>
+              <w:bottom w:val="single" w:color="BFBFBF" w:sz="4"/>
+              <w:right w:val="single" w:color="BFBFBF" w:sz="4"/>
+            </w:tcBorders>
+            <w:tcMar>
+              <w:top w:type="dxa" w:w="80"/>
+              <w:left w:type="dxa" w:w="120"/>
+              <w:bottom w:type="dxa" w:w="80"/>
+              <w:right w:type="dxa" w:w="120"/>
+            </w:tcMar>
+          </w:tcPr>
+          <w:p>
+            <w:r>
+              <w:rPr>
+                <w:b w:val="false"/>
+                <w:bCs w:val="false"/>
+                <w:sz w:val="20"/>
+                <w:szCs w:val="20"/>
+              </w:rPr>
+              <w:t xml:space="preserve">Omni Talk</w:t>
+            </w:r>
+          </w:p>
+        </w:tc>
+      </w:tr>
+      <w:tr>
+        <w:trPr>
+          <w:cantSplit/>
+        </w:trPr>
+        <w:tc>
+          <w:tcPr>
+            <w:tcW w:type="dxa" w:w="2200"/>
+            <w:tcBorders>
+              <w:top w:val="single" w:color="BFBFBF" w:sz="4"/>
+              <w:left w:val="single" w:color="BFBFBF" w:sz="4"/>
+              <w:bottom w:val="single" w:color="BFBFBF" w:sz="4"/>
+              <w:right w:val="single" w:color="BFBFBF" w:sz="4"/>
+            </w:tcBorders>
+            <w:shd w:fill="F2F2F2" w:color="auto" w:val="clear"/>
+            <w:tcMar>
+              <w:top w:type="dxa" w:w="80"/>
+              <w:left w:type="dxa" w:w="120"/>
+              <w:bottom w:type="dxa" w:w="80"/>
+              <w:right w:type="dxa" w:w="120"/>
+            </w:tcMar>
+          </w:tcPr>
+          <w:p>
+            <w:r>
+              <w:rPr>
+                <w:b w:val="false"/>
+                <w:bCs w:val="false"/>
+                <w:sz w:val="20"/>
+                <w:szCs w:val="20"/>
+              </w:rPr>
               <w:t xml:space="preserve">Myron Frazier</w:t>
             </w:r>
           </w:p>
@@ -10287,6 +10405,7 @@
               <w:bottom w:val="single" w:color="BFBFBF" w:sz="4"/>
               <w:right w:val="single" w:color="BFBFBF" w:sz="4"/>
             </w:tcBorders>
+            <w:shd w:fill="F2F2F2" w:color="auto" w:val="clear"/>
             <w:tcMar>
               <w:top w:type="dxa" w:w="80"/>
               <w:left w:type="dxa" w:w="120"/>
@@ -10315,6 +10434,7 @@
               <w:bottom w:val="single" w:color="BFBFBF" w:sz="4"/>
               <w:right w:val="single" w:color="BFBFBF" w:sz="4"/>
             </w:tcBorders>
+            <w:shd w:fill="F2F2F2" w:color="auto" w:val="clear"/>
             <w:tcMar>
               <w:top w:type="dxa" w:w="80"/>
               <w:left w:type="dxa" w:w="120"/>
@@ -10343,6 +10463,7 @@
               <w:bottom w:val="single" w:color="BFBFBF" w:sz="4"/>
               <w:right w:val="single" w:color="BFBFBF" w:sz="4"/>
             </w:tcBorders>
+            <w:shd w:fill="F2F2F2" w:color="auto" w:val="clear"/>
             <w:tcMar>
               <w:top w:type="dxa" w:w="80"/>
               <w:left w:type="dxa" w:w="120"/>
@@ -10364,21 +10485,6 @@
         </w:tc>
       </w:tr>
     </w:tbl>
-    <w:p>
-      <w:pPr>
-        <w:spacing w:after="120"/>
-      </w:pPr>
-      <w:r>
-        <w:rPr>
-          <w:i/>
-          <w:iCs/>
-          <w:color w:val="595959"/>
-          <w:sz w:val="18"/>
-          <w:szCs w:val="18"/>
-        </w:rPr>
-        <w:t xml:space="preserve">The screenshot ends after this speaker; any other speakers or moderator were not shown.</w:t>
-      </w:r>
-    </w:p>
     <w:p>
       <w:pPr>
         <w:pStyle w:val="Heading2"/>

</xml_diff>